<commit_message>
le document corrige le sort du reliquat et sépare les deux rôles du centre de coût
</commit_message>
<xml_diff>
--- a/Document/Portefeuilles_Fonctionnement.docx
+++ b/Document/Portefeuilles_Fonctionnement.docx
@@ -33,7 +33,7 @@
         <w:pStyle w:val="NormalWeb"/>
       </w:pPr>
       <w:r>
-        <w:t>Ce document décrit ce que fait réellement le code aujourd'hui, pas ce qui était prévu. Les sections sont numérotées pour qu'on puisse y revenir point par point. La partie 7 rassemble les points à trancher.</w:t>
+        <w:t>Ce document décrit ce que fait réellement le code aujourd'hui, pas ce qui était prévu. Les sections sont numérotées pour qu'on puisse y revenir point par point. La partie 9 rassemble les points à trancher.</w:t>
       </w:r>
     </w:p>
     <w:p>
@@ -536,6 +536,518 @@
     </w:p>
     <w:p>
       <w:pPr>
+        <w:pStyle w:val="Titre3"/>
+        <w:rPr>
+          <w:rFonts w:eastAsia="Times New Roman"/>
+        </w:rPr>
+      </w:pPr>
+      <w:r>
+        <w:rPr>
+          <w:rFonts w:eastAsia="Times New Roman"/>
+        </w:rPr>
+        <w:t>1.3 Solde et budget sont deux choses différentes</w:t>
+      </w:r>
+    </w:p>
+    <w:p>
+      <w:pPr>
+        <w:pStyle w:val="NormalWeb"/>
+      </w:pPr>
+      <w:r>
+        <w:t>Le mot « budget » prête à confusion, il vaut mieux fixer le vocabulaire tout de suite :</w:t>
+      </w:r>
+    </w:p>
+    <w:tbl>
+      <w:tblPr>
+        <w:tblW w:w="5000" w:type="pct"/>
+        <w:tblCellMar>
+          <w:top w:w="15" w:type="dxa"/>
+          <w:left w:w="15" w:type="dxa"/>
+          <w:bottom w:w="15" w:type="dxa"/>
+          <w:right w:w="15" w:type="dxa"/>
+        </w:tblCellMar>
+        <w:tblLook w:val="04A0" w:firstRow="1" w:lastRow="0" w:firstColumn="1" w:lastColumn="0" w:noHBand="0" w:noVBand="1"/>
+      </w:tblPr>
+      <w:tblGrid>
+        <w:gridCol w:w="1005"/>
+        <w:gridCol w:w="3782"/>
+        <w:gridCol w:w="4269"/>
+      </w:tblGrid>
+      <w:tr>
+        <w:tc>
+          <w:tcPr>
+            <w:tcW w:w="0" w:type="auto"/>
+            <w:tcBorders>
+              <w:top w:val="single" w:sz="6" w:space="0" w:color="9CB0CE"/>
+              <w:left w:val="single" w:sz="6" w:space="0" w:color="9CB0CE"/>
+              <w:bottom w:val="single" w:sz="6" w:space="0" w:color="9CB0CE"/>
+              <w:right w:val="single" w:sz="6" w:space="0" w:color="9CB0CE"/>
+            </w:tcBorders>
+            <w:shd w:val="clear" w:color="auto" w:fill="DEE6F0"/>
+            <w:tcMar>
+              <w:top w:w="100" w:type="dxa"/>
+              <w:left w:w="140" w:type="dxa"/>
+              <w:bottom w:w="100" w:type="dxa"/>
+              <w:right w:w="140" w:type="dxa"/>
+            </w:tcMar>
+            <w:hideMark/>
+          </w:tcPr>
+          <w:p/>
+        </w:tc>
+        <w:tc>
+          <w:tcPr>
+            <w:tcW w:w="0" w:type="auto"/>
+            <w:tcBorders>
+              <w:top w:val="single" w:sz="6" w:space="0" w:color="9CB0CE"/>
+              <w:left w:val="single" w:sz="6" w:space="0" w:color="9CB0CE"/>
+              <w:bottom w:val="single" w:sz="6" w:space="0" w:color="9CB0CE"/>
+              <w:right w:val="single" w:sz="6" w:space="0" w:color="9CB0CE"/>
+            </w:tcBorders>
+            <w:shd w:val="clear" w:color="auto" w:fill="DEE6F0"/>
+            <w:tcMar>
+              <w:top w:w="100" w:type="dxa"/>
+              <w:left w:w="140" w:type="dxa"/>
+              <w:bottom w:w="100" w:type="dxa"/>
+              <w:right w:w="140" w:type="dxa"/>
+            </w:tcMar>
+            <w:hideMark/>
+          </w:tcPr>
+          <w:p>
+            <w:pPr>
+              <w:spacing w:before="160" w:after="160"/>
+              <w:rPr>
+                <w:rFonts w:ascii="Calibri" w:eastAsia="Times New Roman" w:hAnsi="Calibri" w:cs="Calibri"/>
+                <w:b/>
+                <w:bCs/>
+                <w:sz w:val="22"/>
+                <w:szCs w:val="22"/>
+              </w:rPr>
+            </w:pPr>
+            <w:r>
+              <w:rPr>
+                <w:rFonts w:ascii="Calibri" w:eastAsia="Times New Roman" w:hAnsi="Calibri" w:cs="Calibri"/>
+                <w:b/>
+                <w:bCs/>
+                <w:sz w:val="22"/>
+                <w:szCs w:val="22"/>
+              </w:rPr>
+              <w:t>Le solde</w:t>
+            </w:r>
+          </w:p>
+        </w:tc>
+        <w:tc>
+          <w:tcPr>
+            <w:tcW w:w="0" w:type="auto"/>
+            <w:tcBorders>
+              <w:top w:val="single" w:sz="6" w:space="0" w:color="9CB0CE"/>
+              <w:left w:val="single" w:sz="6" w:space="0" w:color="9CB0CE"/>
+              <w:bottom w:val="single" w:sz="6" w:space="0" w:color="9CB0CE"/>
+              <w:right w:val="single" w:sz="6" w:space="0" w:color="9CB0CE"/>
+            </w:tcBorders>
+            <w:shd w:val="clear" w:color="auto" w:fill="DEE6F0"/>
+            <w:tcMar>
+              <w:top w:w="100" w:type="dxa"/>
+              <w:left w:w="140" w:type="dxa"/>
+              <w:bottom w:w="100" w:type="dxa"/>
+              <w:right w:w="140" w:type="dxa"/>
+            </w:tcMar>
+            <w:hideMark/>
+          </w:tcPr>
+          <w:p>
+            <w:pPr>
+              <w:spacing w:before="160" w:after="160"/>
+              <w:rPr>
+                <w:rFonts w:ascii="Calibri" w:eastAsia="Times New Roman" w:hAnsi="Calibri" w:cs="Calibri"/>
+                <w:b/>
+                <w:bCs/>
+                <w:sz w:val="22"/>
+                <w:szCs w:val="22"/>
+              </w:rPr>
+            </w:pPr>
+            <w:r>
+              <w:rPr>
+                <w:rFonts w:ascii="Calibri" w:eastAsia="Times New Roman" w:hAnsi="Calibri" w:cs="Calibri"/>
+                <w:b/>
+                <w:bCs/>
+                <w:sz w:val="22"/>
+                <w:szCs w:val="22"/>
+              </w:rPr>
+              <w:t>Le budget mensuel</w:t>
+            </w:r>
+          </w:p>
+        </w:tc>
+      </w:tr>
+      <w:tr>
+        <w:tc>
+          <w:tcPr>
+            <w:tcW w:w="0" w:type="auto"/>
+            <w:tcBorders>
+              <w:top w:val="single" w:sz="6" w:space="0" w:color="9CB0CE"/>
+              <w:left w:val="single" w:sz="6" w:space="0" w:color="9CB0CE"/>
+              <w:bottom w:val="single" w:sz="6" w:space="0" w:color="9CB0CE"/>
+              <w:right w:val="single" w:sz="6" w:space="0" w:color="9CB0CE"/>
+            </w:tcBorders>
+            <w:tcMar>
+              <w:top w:w="100" w:type="dxa"/>
+              <w:left w:w="140" w:type="dxa"/>
+              <w:bottom w:w="100" w:type="dxa"/>
+              <w:right w:w="140" w:type="dxa"/>
+            </w:tcMar>
+            <w:hideMark/>
+          </w:tcPr>
+          <w:p>
+            <w:pPr>
+              <w:spacing w:before="160" w:after="160"/>
+              <w:rPr>
+                <w:rFonts w:ascii="Calibri" w:eastAsia="Times New Roman" w:hAnsi="Calibri" w:cs="Calibri"/>
+                <w:sz w:val="22"/>
+                <w:szCs w:val="22"/>
+              </w:rPr>
+            </w:pPr>
+            <w:r>
+              <w:rPr>
+                <w:rFonts w:ascii="Calibri" w:eastAsia="Times New Roman" w:hAnsi="Calibri" w:cs="Calibri"/>
+                <w:sz w:val="22"/>
+                <w:szCs w:val="22"/>
+              </w:rPr>
+              <w:t>Nature</w:t>
+            </w:r>
+          </w:p>
+        </w:tc>
+        <w:tc>
+          <w:tcPr>
+            <w:tcW w:w="0" w:type="auto"/>
+            <w:tcBorders>
+              <w:top w:val="single" w:sz="6" w:space="0" w:color="9CB0CE"/>
+              <w:left w:val="single" w:sz="6" w:space="0" w:color="9CB0CE"/>
+              <w:bottom w:val="single" w:sz="6" w:space="0" w:color="9CB0CE"/>
+              <w:right w:val="single" w:sz="6" w:space="0" w:color="9CB0CE"/>
+            </w:tcBorders>
+            <w:tcMar>
+              <w:top w:w="100" w:type="dxa"/>
+              <w:left w:w="140" w:type="dxa"/>
+              <w:bottom w:w="100" w:type="dxa"/>
+              <w:right w:w="140" w:type="dxa"/>
+            </w:tcMar>
+            <w:hideMark/>
+          </w:tcPr>
+          <w:p>
+            <w:pPr>
+              <w:spacing w:before="160" w:after="160"/>
+              <w:rPr>
+                <w:rFonts w:ascii="Calibri" w:eastAsia="Times New Roman" w:hAnsi="Calibri" w:cs="Calibri"/>
+                <w:sz w:val="22"/>
+                <w:szCs w:val="22"/>
+              </w:rPr>
+            </w:pPr>
+            <w:r>
+              <w:rPr>
+                <w:rFonts w:ascii="Calibri" w:eastAsia="Times New Roman" w:hAnsi="Calibri" w:cs="Calibri"/>
+                <w:sz w:val="22"/>
+                <w:szCs w:val="22"/>
+              </w:rPr>
+              <w:t>De l'argent réel</w:t>
+            </w:r>
+          </w:p>
+        </w:tc>
+        <w:tc>
+          <w:tcPr>
+            <w:tcW w:w="0" w:type="auto"/>
+            <w:tcBorders>
+              <w:top w:val="single" w:sz="6" w:space="0" w:color="9CB0CE"/>
+              <w:left w:val="single" w:sz="6" w:space="0" w:color="9CB0CE"/>
+              <w:bottom w:val="single" w:sz="6" w:space="0" w:color="9CB0CE"/>
+              <w:right w:val="single" w:sz="6" w:space="0" w:color="9CB0CE"/>
+            </w:tcBorders>
+            <w:tcMar>
+              <w:top w:w="100" w:type="dxa"/>
+              <w:left w:w="140" w:type="dxa"/>
+              <w:bottom w:w="100" w:type="dxa"/>
+              <w:right w:w="140" w:type="dxa"/>
+            </w:tcMar>
+            <w:hideMark/>
+          </w:tcPr>
+          <w:p>
+            <w:pPr>
+              <w:spacing w:before="160" w:after="160"/>
+              <w:rPr>
+                <w:rFonts w:ascii="Calibri" w:eastAsia="Times New Roman" w:hAnsi="Calibri" w:cs="Calibri"/>
+                <w:sz w:val="22"/>
+                <w:szCs w:val="22"/>
+              </w:rPr>
+            </w:pPr>
+            <w:r>
+              <w:rPr>
+                <w:rFonts w:ascii="Calibri" w:eastAsia="Times New Roman" w:hAnsi="Calibri" w:cs="Calibri"/>
+                <w:sz w:val="22"/>
+                <w:szCs w:val="22"/>
+              </w:rPr>
+              <w:t xml:space="preserve">Une </w:t>
+            </w:r>
+            <w:r>
+              <w:rPr>
+                <w:rFonts w:ascii="Calibri" w:eastAsia="Times New Roman" w:hAnsi="Calibri" w:cs="Calibri"/>
+                <w:b/>
+                <w:bCs/>
+                <w:sz w:val="22"/>
+                <w:szCs w:val="22"/>
+              </w:rPr>
+              <w:t>cible</w:t>
+            </w:r>
+            <w:r>
+              <w:rPr>
+                <w:rFonts w:ascii="Calibri" w:eastAsia="Times New Roman" w:hAnsi="Calibri" w:cs="Calibri"/>
+                <w:sz w:val="22"/>
+                <w:szCs w:val="22"/>
+              </w:rPr>
+              <w:t>, un plafond</w:t>
+            </w:r>
+          </w:p>
+        </w:tc>
+      </w:tr>
+      <w:tr>
+        <w:tc>
+          <w:tcPr>
+            <w:tcW w:w="0" w:type="auto"/>
+            <w:tcBorders>
+              <w:top w:val="single" w:sz="6" w:space="0" w:color="9CB0CE"/>
+              <w:left w:val="single" w:sz="6" w:space="0" w:color="9CB0CE"/>
+              <w:bottom w:val="single" w:sz="6" w:space="0" w:color="9CB0CE"/>
+              <w:right w:val="single" w:sz="6" w:space="0" w:color="9CB0CE"/>
+            </w:tcBorders>
+            <w:tcMar>
+              <w:top w:w="100" w:type="dxa"/>
+              <w:left w:w="140" w:type="dxa"/>
+              <w:bottom w:w="100" w:type="dxa"/>
+              <w:right w:w="140" w:type="dxa"/>
+            </w:tcMar>
+            <w:hideMark/>
+          </w:tcPr>
+          <w:p>
+            <w:pPr>
+              <w:spacing w:before="160" w:after="160"/>
+              <w:rPr>
+                <w:rFonts w:ascii="Calibri" w:eastAsia="Times New Roman" w:hAnsi="Calibri" w:cs="Calibri"/>
+                <w:sz w:val="22"/>
+                <w:szCs w:val="22"/>
+              </w:rPr>
+            </w:pPr>
+            <w:r>
+              <w:rPr>
+                <w:rFonts w:ascii="Calibri" w:eastAsia="Times New Roman" w:hAnsi="Calibri" w:cs="Calibri"/>
+                <w:sz w:val="22"/>
+                <w:szCs w:val="22"/>
+              </w:rPr>
+              <w:t>Origine</w:t>
+            </w:r>
+          </w:p>
+        </w:tc>
+        <w:tc>
+          <w:tcPr>
+            <w:tcW w:w="0" w:type="auto"/>
+            <w:tcBorders>
+              <w:top w:val="single" w:sz="6" w:space="0" w:color="9CB0CE"/>
+              <w:left w:val="single" w:sz="6" w:space="0" w:color="9CB0CE"/>
+              <w:bottom w:val="single" w:sz="6" w:space="0" w:color="9CB0CE"/>
+              <w:right w:val="single" w:sz="6" w:space="0" w:color="9CB0CE"/>
+            </w:tcBorders>
+            <w:tcMar>
+              <w:top w:w="100" w:type="dxa"/>
+              <w:left w:w="140" w:type="dxa"/>
+              <w:bottom w:w="100" w:type="dxa"/>
+              <w:right w:w="140" w:type="dxa"/>
+            </w:tcMar>
+            <w:hideMark/>
+          </w:tcPr>
+          <w:p>
+            <w:pPr>
+              <w:spacing w:before="160" w:after="160"/>
+              <w:rPr>
+                <w:rFonts w:ascii="Calibri" w:eastAsia="Times New Roman" w:hAnsi="Calibri" w:cs="Calibri"/>
+                <w:sz w:val="22"/>
+                <w:szCs w:val="22"/>
+              </w:rPr>
+            </w:pPr>
+            <w:r>
+              <w:rPr>
+                <w:rFonts w:ascii="Calibri" w:eastAsia="Times New Roman" w:hAnsi="Calibri" w:cs="Calibri"/>
+                <w:sz w:val="22"/>
+                <w:szCs w:val="22"/>
+              </w:rPr>
+              <w:t>Les écritures comptables</w:t>
+            </w:r>
+          </w:p>
+        </w:tc>
+        <w:tc>
+          <w:tcPr>
+            <w:tcW w:w="0" w:type="auto"/>
+            <w:tcBorders>
+              <w:top w:val="single" w:sz="6" w:space="0" w:color="9CB0CE"/>
+              <w:left w:val="single" w:sz="6" w:space="0" w:color="9CB0CE"/>
+              <w:bottom w:val="single" w:sz="6" w:space="0" w:color="9CB0CE"/>
+              <w:right w:val="single" w:sz="6" w:space="0" w:color="9CB0CE"/>
+            </w:tcBorders>
+            <w:tcMar>
+              <w:top w:w="100" w:type="dxa"/>
+              <w:left w:w="140" w:type="dxa"/>
+              <w:bottom w:w="100" w:type="dxa"/>
+              <w:right w:w="140" w:type="dxa"/>
+            </w:tcMar>
+            <w:hideMark/>
+          </w:tcPr>
+          <w:p>
+            <w:pPr>
+              <w:spacing w:before="160" w:after="160"/>
+              <w:rPr>
+                <w:rFonts w:ascii="Calibri" w:eastAsia="Times New Roman" w:hAnsi="Calibri" w:cs="Calibri"/>
+                <w:sz w:val="22"/>
+                <w:szCs w:val="22"/>
+              </w:rPr>
+            </w:pPr>
+            <w:r>
+              <w:rPr>
+                <w:rFonts w:ascii="Calibri" w:eastAsia="Times New Roman" w:hAnsi="Calibri" w:cs="Calibri"/>
+                <w:sz w:val="22"/>
+                <w:szCs w:val="22"/>
+              </w:rPr>
+              <w:t>Un champ saisi ou hérité</w:t>
+            </w:r>
+          </w:p>
+        </w:tc>
+      </w:tr>
+      <w:tr>
+        <w:tc>
+          <w:tcPr>
+            <w:tcW w:w="0" w:type="auto"/>
+            <w:tcBorders>
+              <w:top w:val="single" w:sz="6" w:space="0" w:color="9CB0CE"/>
+              <w:left w:val="single" w:sz="6" w:space="0" w:color="9CB0CE"/>
+              <w:bottom w:val="single" w:sz="6" w:space="0" w:color="9CB0CE"/>
+              <w:right w:val="single" w:sz="6" w:space="0" w:color="9CB0CE"/>
+            </w:tcBorders>
+            <w:tcMar>
+              <w:top w:w="100" w:type="dxa"/>
+              <w:left w:w="140" w:type="dxa"/>
+              <w:bottom w:w="100" w:type="dxa"/>
+              <w:right w:w="140" w:type="dxa"/>
+            </w:tcMar>
+            <w:hideMark/>
+          </w:tcPr>
+          <w:p>
+            <w:pPr>
+              <w:spacing w:before="160" w:after="160"/>
+              <w:rPr>
+                <w:rFonts w:ascii="Calibri" w:eastAsia="Times New Roman" w:hAnsi="Calibri" w:cs="Calibri"/>
+                <w:sz w:val="22"/>
+                <w:szCs w:val="22"/>
+              </w:rPr>
+            </w:pPr>
+            <w:r>
+              <w:rPr>
+                <w:rFonts w:ascii="Calibri" w:eastAsia="Times New Roman" w:hAnsi="Calibri" w:cs="Calibri"/>
+                <w:sz w:val="22"/>
+                <w:szCs w:val="22"/>
+              </w:rPr>
+              <w:t>Effet</w:t>
+            </w:r>
+          </w:p>
+        </w:tc>
+        <w:tc>
+          <w:tcPr>
+            <w:tcW w:w="0" w:type="auto"/>
+            <w:tcBorders>
+              <w:top w:val="single" w:sz="6" w:space="0" w:color="9CB0CE"/>
+              <w:left w:val="single" w:sz="6" w:space="0" w:color="9CB0CE"/>
+              <w:bottom w:val="single" w:sz="6" w:space="0" w:color="9CB0CE"/>
+              <w:right w:val="single" w:sz="6" w:space="0" w:color="9CB0CE"/>
+            </w:tcBorders>
+            <w:tcMar>
+              <w:top w:w="100" w:type="dxa"/>
+              <w:left w:w="140" w:type="dxa"/>
+              <w:bottom w:w="100" w:type="dxa"/>
+              <w:right w:w="140" w:type="dxa"/>
+            </w:tcMar>
+            <w:hideMark/>
+          </w:tcPr>
+          <w:p>
+            <w:pPr>
+              <w:spacing w:before="160" w:after="160"/>
+              <w:rPr>
+                <w:rFonts w:ascii="Calibri" w:eastAsia="Times New Roman" w:hAnsi="Calibri" w:cs="Calibri"/>
+                <w:sz w:val="22"/>
+                <w:szCs w:val="22"/>
+              </w:rPr>
+            </w:pPr>
+            <w:r>
+              <w:rPr>
+                <w:rFonts w:ascii="Calibri" w:eastAsia="Times New Roman" w:hAnsi="Calibri" w:cs="Calibri"/>
+                <w:sz w:val="22"/>
+                <w:szCs w:val="22"/>
+              </w:rPr>
+              <w:t>Ce qu'on peut dépenser maintenant</w:t>
+            </w:r>
+          </w:p>
+        </w:tc>
+        <w:tc>
+          <w:tcPr>
+            <w:tcW w:w="0" w:type="auto"/>
+            <w:tcBorders>
+              <w:top w:val="single" w:sz="6" w:space="0" w:color="9CB0CE"/>
+              <w:left w:val="single" w:sz="6" w:space="0" w:color="9CB0CE"/>
+              <w:bottom w:val="single" w:sz="6" w:space="0" w:color="9CB0CE"/>
+              <w:right w:val="single" w:sz="6" w:space="0" w:color="9CB0CE"/>
+            </w:tcBorders>
+            <w:tcMar>
+              <w:top w:w="100" w:type="dxa"/>
+              <w:left w:w="140" w:type="dxa"/>
+              <w:bottom w:w="100" w:type="dxa"/>
+              <w:right w:w="140" w:type="dxa"/>
+            </w:tcMar>
+            <w:hideMark/>
+          </w:tcPr>
+          <w:p>
+            <w:pPr>
+              <w:spacing w:before="160" w:after="160"/>
+              <w:rPr>
+                <w:rFonts w:ascii="Calibri" w:eastAsia="Times New Roman" w:hAnsi="Calibri" w:cs="Calibri"/>
+                <w:sz w:val="22"/>
+                <w:szCs w:val="22"/>
+              </w:rPr>
+            </w:pPr>
+            <w:r>
+              <w:rPr>
+                <w:rFonts w:ascii="Calibri" w:eastAsia="Times New Roman" w:hAnsi="Calibri" w:cs="Calibri"/>
+                <w:sz w:val="22"/>
+                <w:szCs w:val="22"/>
+              </w:rPr>
+              <w:t>Ce que le réajustement automatique vise</w:t>
+            </w:r>
+          </w:p>
+        </w:tc>
+      </w:tr>
+    </w:tbl>
+    <w:p>
+      <w:pPr>
+        <w:pStyle w:val="NormalWeb"/>
+      </w:pPr>
+      <w:r>
+        <w:t xml:space="preserve">Un portefeuille </w:t>
+      </w:r>
+      <w:r>
+        <w:rPr>
+          <w:b/>
+          <w:bCs/>
+        </w:rPr>
+        <w:t>sans</w:t>
+      </w:r>
+      <w:r>
+        <w:t xml:space="preserve"> </w:t>
+      </w:r>
+      <w:r>
+        <w:t>budget mensuel fonctionne parfaitement : il n'est simplement jamais réajusté tout seul, et vit uniquement des demandes de recharge.</w:t>
+      </w:r>
+    </w:p>
+    <w:p>
+      <w:pPr>
         <w:pStyle w:val="Titre2"/>
         <w:rPr>
           <w:rFonts w:eastAsia="Times New Roman"/>
@@ -567,7 +1079,6 @@
         <w:pStyle w:val="NormalWeb"/>
       </w:pPr>
       <w:r>
-        <w:lastRenderedPageBreak/>
         <w:t xml:space="preserve">La permission </w:t>
       </w:r>
       <w:r>
@@ -1560,6 +2071,7 @@
                 <w:sz w:val="22"/>
                 <w:szCs w:val="22"/>
               </w:rPr>
+              <w:lastRenderedPageBreak/>
               <w:t>Solde initial</w:t>
             </w:r>
           </w:p>
@@ -1798,7 +2310,7 @@
                 <w:sz w:val="22"/>
                 <w:szCs w:val="22"/>
               </w:rPr>
-              <w:t xml:space="preserve"> — voir 4.1</w:t>
+              <w:t xml:space="preserve"> — voir 5.1</w:t>
             </w:r>
           </w:p>
         </w:tc>
@@ -1831,7 +2343,10 @@
         <w:pStyle w:val="NormalWeb"/>
       </w:pPr>
       <w:r>
-        <w:t>C'est volontaire. Réutiliser le code d'un portefeuille supprimé rendrait l'historique comptable ambigu : deux enveloppes différentes porteraient le même nom dans les archives.</w:t>
+        <w:t xml:space="preserve">C'est volontaire. Réutiliser le code d'un portefeuille supprimé rendrait l'historique </w:t>
+      </w:r>
+      <w:r>
+        <w:t>comptable ambigu : deux enveloppes différentes porteraient le même nom dans les archives.</w:t>
       </w:r>
     </w:p>
     <w:p>
@@ -1880,8 +2395,10 @@
         <w:pStyle w:val="NormalWeb"/>
       </w:pPr>
       <w:r>
-        <w:lastRenderedPageBreak/>
-        <w:t>La raison : puisque le solde est recalculé depuis l'amorce (voir 1.2), changer l'amorce réécrirait rétroactivement tout l'historique de solde. Un relevé imprimé le mois dernier ne correspondrait plus à ce que l'application affiche aujourd'hui.</w:t>
+        <w:t xml:space="preserve">La raison : puisque le solde est recalculé depuis l'amorce (voir 1.2), changer l'amorce réécrirait rétroactivement tout l'historique de solde. Un relevé imprimé le mois dernier ne </w:t>
+      </w:r>
+      <w:r>
+        <w:t>correspondrait plus à ce que l'application affiche aujourd'hui.</w:t>
       </w:r>
     </w:p>
     <w:p>
@@ -1913,21 +2430,7 @@
         <w:rPr>
           <w:rFonts w:eastAsia="Times New Roman"/>
         </w:rPr>
-        <w:t>3. Le budget mensuel</w:t>
-      </w:r>
-    </w:p>
-    <w:p>
-      <w:pPr>
-        <w:pStyle w:val="Titre3"/>
-        <w:rPr>
-          <w:rFonts w:eastAsia="Times New Roman"/>
-        </w:rPr>
-      </w:pPr>
-      <w:r>
-        <w:rPr>
-          <w:rFonts w:eastAsia="Times New Roman"/>
-        </w:rPr>
-        <w:t>3.1 Le principe : recharge mensuelle, sans report</w:t>
+        <w:t>3. Comment l'argent entre dans un portefeuille</w:t>
       </w:r>
     </w:p>
     <w:p>
@@ -1935,17 +2438,7 @@
         <w:pStyle w:val="NormalWeb"/>
       </w:pPr>
       <w:r>
-        <w:t xml:space="preserve">Un portefeuille peut avoir un plafond mensuel. Au passage dans un nouveau mois, il est ramené </w:t>
-      </w:r>
-      <w:r>
-        <w:rPr>
-          <w:b/>
-          <w:bCs/>
-        </w:rPr>
-        <w:t>exactement</w:t>
-      </w:r>
-      <w:r>
-        <w:t xml:space="preserve"> à ce plafond :</w:t>
+        <w:t>Il y a exactement trois voies, et une seule d'entre elles est automatique.</w:t>
       </w:r>
     </w:p>
     <w:tbl>
@@ -1960,8 +2453,9 @@
         <w:tblLook w:val="04A0" w:firstRow="1" w:lastRow="0" w:firstColumn="1" w:lastColumn="0" w:noHBand="0" w:noVBand="1"/>
       </w:tblPr>
       <w:tblGrid>
-        <w:gridCol w:w="2701"/>
-        <w:gridCol w:w="6355"/>
+        <w:gridCol w:w="1950"/>
+        <w:gridCol w:w="1896"/>
+        <w:gridCol w:w="5210"/>
       </w:tblGrid>
       <w:tr>
         <w:tc>
@@ -2001,7 +2495,7 @@
                 <w:sz w:val="22"/>
                 <w:szCs w:val="22"/>
               </w:rPr>
-              <w:t>Situation en fin de mois</w:t>
+              <w:t>Voie</w:t>
             </w:r>
           </w:p>
         </w:tc>
@@ -2042,7 +2536,48 @@
                 <w:sz w:val="22"/>
                 <w:szCs w:val="22"/>
               </w:rPr>
-              <w:t>Ce qui se passe</w:t>
+              <w:t>Quand</w:t>
+            </w:r>
+          </w:p>
+        </w:tc>
+        <w:tc>
+          <w:tcPr>
+            <w:tcW w:w="0" w:type="auto"/>
+            <w:tcBorders>
+              <w:top w:val="single" w:sz="6" w:space="0" w:color="9CB0CE"/>
+              <w:left w:val="single" w:sz="6" w:space="0" w:color="9CB0CE"/>
+              <w:bottom w:val="single" w:sz="6" w:space="0" w:color="9CB0CE"/>
+              <w:right w:val="single" w:sz="6" w:space="0" w:color="9CB0CE"/>
+            </w:tcBorders>
+            <w:shd w:val="clear" w:color="auto" w:fill="DEE6F0"/>
+            <w:tcMar>
+              <w:top w:w="100" w:type="dxa"/>
+              <w:left w:w="140" w:type="dxa"/>
+              <w:bottom w:w="100" w:type="dxa"/>
+              <w:right w:w="140" w:type="dxa"/>
+            </w:tcMar>
+            <w:hideMark/>
+          </w:tcPr>
+          <w:p>
+            <w:pPr>
+              <w:spacing w:before="160" w:after="160"/>
+              <w:rPr>
+                <w:rFonts w:ascii="Calibri" w:eastAsia="Times New Roman" w:hAnsi="Calibri" w:cs="Calibri"/>
+                <w:b/>
+                <w:bCs/>
+                <w:sz w:val="22"/>
+                <w:szCs w:val="22"/>
+              </w:rPr>
+            </w:pPr>
+            <w:r>
+              <w:rPr>
+                <w:rFonts w:ascii="Calibri" w:eastAsia="Times New Roman" w:hAnsi="Calibri" w:cs="Calibri"/>
+                <w:b/>
+                <w:bCs/>
+                <w:sz w:val="22"/>
+                <w:szCs w:val="22"/>
+              </w:rPr>
+              <w:t>Qui déclenche</w:t>
             </w:r>
           </w:p>
         </w:tc>
@@ -2077,64 +2612,84 @@
             <w:r>
               <w:rPr>
                 <w:rFonts w:ascii="Calibri" w:eastAsia="Times New Roman" w:hAnsi="Calibri" w:cs="Calibri"/>
-                <w:sz w:val="22"/>
-                <w:szCs w:val="22"/>
-              </w:rPr>
-              <w:t xml:space="preserve">Solde </w:t>
-            </w:r>
-            <w:r>
-              <w:rPr>
-                <w:rFonts w:ascii="Calibri" w:eastAsia="Times New Roman" w:hAnsi="Calibri" w:cs="Calibri"/>
                 <w:b/>
                 <w:bCs/>
                 <w:sz w:val="22"/>
                 <w:szCs w:val="22"/>
               </w:rPr>
-              <w:t>en dessous</w:t>
-            </w:r>
-            <w:r>
-              <w:rPr>
-                <w:rFonts w:ascii="Calibri" w:eastAsia="Times New Roman" w:hAnsi="Calibri" w:cs="Calibri"/>
-                <w:sz w:val="22"/>
-                <w:szCs w:val="22"/>
-              </w:rPr>
-              <w:t xml:space="preserve"> du plafond</w:t>
-            </w:r>
-          </w:p>
-        </w:tc>
-        <w:tc>
-          <w:tcPr>
-            <w:tcW w:w="0" w:type="auto"/>
-            <w:tcBorders>
-              <w:top w:val="single" w:sz="6" w:space="0" w:color="9CB0CE"/>
-              <w:left w:val="single" w:sz="6" w:space="0" w:color="9CB0CE"/>
-              <w:bottom w:val="single" w:sz="6" w:space="0" w:color="9CB0CE"/>
-              <w:right w:val="single" w:sz="6" w:space="0" w:color="9CB0CE"/>
-            </w:tcBorders>
-            <w:tcMar>
-              <w:top w:w="100" w:type="dxa"/>
-              <w:left w:w="140" w:type="dxa"/>
-              <w:bottom w:w="100" w:type="dxa"/>
-              <w:right w:w="140" w:type="dxa"/>
-            </w:tcMar>
-            <w:hideMark/>
-          </w:tcPr>
-          <w:p>
-            <w:pPr>
-              <w:spacing w:before="160" w:after="160"/>
-              <w:rPr>
-                <w:rFonts w:ascii="Calibri" w:eastAsia="Times New Roman" w:hAnsi="Calibri" w:cs="Calibri"/>
-                <w:sz w:val="22"/>
-                <w:szCs w:val="22"/>
-              </w:rPr>
-            </w:pPr>
-            <w:r>
-              <w:rPr>
-                <w:rFonts w:ascii="Calibri" w:eastAsia="Times New Roman" w:hAnsi="Calibri" w:cs="Calibri"/>
-                <w:sz w:val="22"/>
-                <w:szCs w:val="22"/>
-              </w:rPr>
-              <w:t>Recharge du manque : la caisse source est débitée, le portefeuille crédité</w:t>
+              <w:t>Solde initial</w:t>
+            </w:r>
+          </w:p>
+        </w:tc>
+        <w:tc>
+          <w:tcPr>
+            <w:tcW w:w="0" w:type="auto"/>
+            <w:tcBorders>
+              <w:top w:val="single" w:sz="6" w:space="0" w:color="9CB0CE"/>
+              <w:left w:val="single" w:sz="6" w:space="0" w:color="9CB0CE"/>
+              <w:bottom w:val="single" w:sz="6" w:space="0" w:color="9CB0CE"/>
+              <w:right w:val="single" w:sz="6" w:space="0" w:color="9CB0CE"/>
+            </w:tcBorders>
+            <w:tcMar>
+              <w:top w:w="100" w:type="dxa"/>
+              <w:left w:w="140" w:type="dxa"/>
+              <w:bottom w:w="100" w:type="dxa"/>
+              <w:right w:w="140" w:type="dxa"/>
+            </w:tcMar>
+            <w:hideMark/>
+          </w:tcPr>
+          <w:p>
+            <w:pPr>
+              <w:spacing w:before="160" w:after="160"/>
+              <w:rPr>
+                <w:rFonts w:ascii="Calibri" w:eastAsia="Times New Roman" w:hAnsi="Calibri" w:cs="Calibri"/>
+                <w:sz w:val="22"/>
+                <w:szCs w:val="22"/>
+              </w:rPr>
+            </w:pPr>
+            <w:r>
+              <w:rPr>
+                <w:rFonts w:ascii="Calibri" w:eastAsia="Times New Roman" w:hAnsi="Calibri" w:cs="Calibri"/>
+                <w:sz w:val="22"/>
+                <w:szCs w:val="22"/>
+              </w:rPr>
+              <w:t>À la création, une seule fois</w:t>
+            </w:r>
+          </w:p>
+        </w:tc>
+        <w:tc>
+          <w:tcPr>
+            <w:tcW w:w="0" w:type="auto"/>
+            <w:tcBorders>
+              <w:top w:val="single" w:sz="6" w:space="0" w:color="9CB0CE"/>
+              <w:left w:val="single" w:sz="6" w:space="0" w:color="9CB0CE"/>
+              <w:bottom w:val="single" w:sz="6" w:space="0" w:color="9CB0CE"/>
+              <w:right w:val="single" w:sz="6" w:space="0" w:color="9CB0CE"/>
+            </w:tcBorders>
+            <w:tcMar>
+              <w:top w:w="100" w:type="dxa"/>
+              <w:left w:w="140" w:type="dxa"/>
+              <w:bottom w:w="100" w:type="dxa"/>
+              <w:right w:w="140" w:type="dxa"/>
+            </w:tcMar>
+            <w:hideMark/>
+          </w:tcPr>
+          <w:p>
+            <w:pPr>
+              <w:spacing w:before="160" w:after="160"/>
+              <w:rPr>
+                <w:rFonts w:ascii="Calibri" w:eastAsia="Times New Roman" w:hAnsi="Calibri" w:cs="Calibri"/>
+                <w:sz w:val="22"/>
+                <w:szCs w:val="22"/>
+              </w:rPr>
+            </w:pPr>
+            <w:r>
+              <w:rPr>
+                <w:rFonts w:ascii="Calibri" w:eastAsia="Times New Roman" w:hAnsi="Calibri" w:cs="Calibri"/>
+                <w:sz w:val="22"/>
+                <w:szCs w:val="22"/>
+              </w:rPr>
+              <w:t>Celui qui crée le portefeuille. Se verrouille dès la première écriture.</w:t>
             </w:r>
           </w:p>
         </w:tc>
@@ -2169,64 +2724,102 @@
             <w:r>
               <w:rPr>
                 <w:rFonts w:ascii="Calibri" w:eastAsia="Times New Roman" w:hAnsi="Calibri" w:cs="Calibri"/>
-                <w:sz w:val="22"/>
-                <w:szCs w:val="22"/>
-              </w:rPr>
-              <w:t xml:space="preserve">Solde </w:t>
-            </w:r>
-            <w:r>
-              <w:rPr>
-                <w:rFonts w:ascii="Calibri" w:eastAsia="Times New Roman" w:hAnsi="Calibri" w:cs="Calibri"/>
                 <w:b/>
                 <w:bCs/>
                 <w:sz w:val="22"/>
                 <w:szCs w:val="22"/>
               </w:rPr>
-              <w:t>au-dessus</w:t>
-            </w:r>
-            <w:r>
-              <w:rPr>
-                <w:rFonts w:ascii="Calibri" w:eastAsia="Times New Roman" w:hAnsi="Calibri" w:cs="Calibri"/>
-                <w:sz w:val="22"/>
-                <w:szCs w:val="22"/>
-              </w:rPr>
-              <w:t xml:space="preserve"> du plafond</w:t>
-            </w:r>
-          </w:p>
-        </w:tc>
-        <w:tc>
-          <w:tcPr>
-            <w:tcW w:w="0" w:type="auto"/>
-            <w:tcBorders>
-              <w:top w:val="single" w:sz="6" w:space="0" w:color="9CB0CE"/>
-              <w:left w:val="single" w:sz="6" w:space="0" w:color="9CB0CE"/>
-              <w:bottom w:val="single" w:sz="6" w:space="0" w:color="9CB0CE"/>
-              <w:right w:val="single" w:sz="6" w:space="0" w:color="9CB0CE"/>
-            </w:tcBorders>
-            <w:tcMar>
-              <w:top w:w="100" w:type="dxa"/>
-              <w:left w:w="140" w:type="dxa"/>
-              <w:bottom w:w="100" w:type="dxa"/>
-              <w:right w:w="140" w:type="dxa"/>
-            </w:tcMar>
-            <w:hideMark/>
-          </w:tcPr>
-          <w:p>
-            <w:pPr>
-              <w:spacing w:before="160" w:after="160"/>
-              <w:rPr>
-                <w:rFonts w:ascii="Calibri" w:eastAsia="Times New Roman" w:hAnsi="Calibri" w:cs="Calibri"/>
-                <w:sz w:val="22"/>
-                <w:szCs w:val="22"/>
-              </w:rPr>
-            </w:pPr>
-            <w:r>
-              <w:rPr>
-                <w:rFonts w:ascii="Calibri" w:eastAsia="Times New Roman" w:hAnsi="Calibri" w:cs="Calibri"/>
-                <w:sz w:val="22"/>
-                <w:szCs w:val="22"/>
-              </w:rPr>
-              <w:t>Reprise du reliquat : le portefeuille est débité, la caisse recréditée</w:t>
+              <w:t>Demande de recharge</w:t>
+            </w:r>
+          </w:p>
+        </w:tc>
+        <w:tc>
+          <w:tcPr>
+            <w:tcW w:w="0" w:type="auto"/>
+            <w:tcBorders>
+              <w:top w:val="single" w:sz="6" w:space="0" w:color="9CB0CE"/>
+              <w:left w:val="single" w:sz="6" w:space="0" w:color="9CB0CE"/>
+              <w:bottom w:val="single" w:sz="6" w:space="0" w:color="9CB0CE"/>
+              <w:right w:val="single" w:sz="6" w:space="0" w:color="9CB0CE"/>
+            </w:tcBorders>
+            <w:tcMar>
+              <w:top w:w="100" w:type="dxa"/>
+              <w:left w:w="140" w:type="dxa"/>
+              <w:bottom w:w="100" w:type="dxa"/>
+              <w:right w:w="140" w:type="dxa"/>
+            </w:tcMar>
+            <w:hideMark/>
+          </w:tcPr>
+          <w:p>
+            <w:pPr>
+              <w:spacing w:before="160" w:after="160"/>
+              <w:rPr>
+                <w:rFonts w:ascii="Calibri" w:eastAsia="Times New Roman" w:hAnsi="Calibri" w:cs="Calibri"/>
+                <w:sz w:val="22"/>
+                <w:szCs w:val="22"/>
+              </w:rPr>
+            </w:pPr>
+            <w:r>
+              <w:rPr>
+                <w:rFonts w:ascii="Calibri" w:eastAsia="Times New Roman" w:hAnsi="Calibri" w:cs="Calibri"/>
+                <w:sz w:val="22"/>
+                <w:szCs w:val="22"/>
+              </w:rPr>
+              <w:t>À tout moment</w:t>
+            </w:r>
+          </w:p>
+        </w:tc>
+        <w:tc>
+          <w:tcPr>
+            <w:tcW w:w="0" w:type="auto"/>
+            <w:tcBorders>
+              <w:top w:val="single" w:sz="6" w:space="0" w:color="9CB0CE"/>
+              <w:left w:val="single" w:sz="6" w:space="0" w:color="9CB0CE"/>
+              <w:bottom w:val="single" w:sz="6" w:space="0" w:color="9CB0CE"/>
+              <w:right w:val="single" w:sz="6" w:space="0" w:color="9CB0CE"/>
+            </w:tcBorders>
+            <w:tcMar>
+              <w:top w:w="100" w:type="dxa"/>
+              <w:left w:w="140" w:type="dxa"/>
+              <w:bottom w:w="100" w:type="dxa"/>
+              <w:right w:w="140" w:type="dxa"/>
+            </w:tcMar>
+            <w:hideMark/>
+          </w:tcPr>
+          <w:p>
+            <w:pPr>
+              <w:spacing w:before="160" w:after="160"/>
+              <w:rPr>
+                <w:rFonts w:ascii="Calibri" w:eastAsia="Times New Roman" w:hAnsi="Calibri" w:cs="Calibri"/>
+                <w:sz w:val="22"/>
+                <w:szCs w:val="22"/>
+              </w:rPr>
+            </w:pPr>
+            <w:r>
+              <w:rPr>
+                <w:rFonts w:ascii="Calibri" w:eastAsia="Times New Roman" w:hAnsi="Calibri" w:cs="Calibri"/>
+                <w:sz w:val="22"/>
+                <w:szCs w:val="22"/>
+              </w:rPr>
+              <w:t xml:space="preserve">Le porteur demande, un </w:t>
+            </w:r>
+            <w:r>
+              <w:rPr>
+                <w:rFonts w:ascii="Calibri" w:eastAsia="Times New Roman" w:hAnsi="Calibri" w:cs="Calibri"/>
+                <w:b/>
+                <w:bCs/>
+                <w:sz w:val="22"/>
+                <w:szCs w:val="22"/>
+              </w:rPr>
+              <w:t>caissier</w:t>
+            </w:r>
+            <w:r>
+              <w:rPr>
+                <w:rFonts w:ascii="Calibri" w:eastAsia="Times New Roman" w:hAnsi="Calibri" w:cs="Calibri"/>
+                <w:sz w:val="22"/>
+                <w:szCs w:val="22"/>
+              </w:rPr>
+              <w:t xml:space="preserve"> traite. Le caissier peut servir un montant différent de celui demandé.</w:t>
             </w:r>
           </w:p>
         </w:tc>
@@ -2261,64 +2854,84 @@
             <w:r>
               <w:rPr>
                 <w:rFonts w:ascii="Calibri" w:eastAsia="Times New Roman" w:hAnsi="Calibri" w:cs="Calibri"/>
-                <w:sz w:val="22"/>
-                <w:szCs w:val="22"/>
-              </w:rPr>
-              <w:t xml:space="preserve">Solde </w:t>
-            </w:r>
-            <w:r>
-              <w:rPr>
-                <w:rFonts w:ascii="Calibri" w:eastAsia="Times New Roman" w:hAnsi="Calibri" w:cs="Calibri"/>
                 <w:b/>
                 <w:bCs/>
                 <w:sz w:val="22"/>
                 <w:szCs w:val="22"/>
               </w:rPr>
-              <w:t>égal</w:t>
-            </w:r>
-            <w:r>
-              <w:rPr>
-                <w:rFonts w:ascii="Calibri" w:eastAsia="Times New Roman" w:hAnsi="Calibri" w:cs="Calibri"/>
-                <w:sz w:val="22"/>
-                <w:szCs w:val="22"/>
-              </w:rPr>
-              <w:t xml:space="preserve"> au plafond</w:t>
-            </w:r>
-          </w:p>
-        </w:tc>
-        <w:tc>
-          <w:tcPr>
-            <w:tcW w:w="0" w:type="auto"/>
-            <w:tcBorders>
-              <w:top w:val="single" w:sz="6" w:space="0" w:color="9CB0CE"/>
-              <w:left w:val="single" w:sz="6" w:space="0" w:color="9CB0CE"/>
-              <w:bottom w:val="single" w:sz="6" w:space="0" w:color="9CB0CE"/>
-              <w:right w:val="single" w:sz="6" w:space="0" w:color="9CB0CE"/>
-            </w:tcBorders>
-            <w:tcMar>
-              <w:top w:w="100" w:type="dxa"/>
-              <w:left w:w="140" w:type="dxa"/>
-              <w:bottom w:w="100" w:type="dxa"/>
-              <w:right w:w="140" w:type="dxa"/>
-            </w:tcMar>
-            <w:hideMark/>
-          </w:tcPr>
-          <w:p>
-            <w:pPr>
-              <w:spacing w:before="160" w:after="160"/>
-              <w:rPr>
-                <w:rFonts w:ascii="Calibri" w:eastAsia="Times New Roman" w:hAnsi="Calibri" w:cs="Calibri"/>
-                <w:sz w:val="22"/>
-                <w:szCs w:val="22"/>
-              </w:rPr>
-            </w:pPr>
-            <w:r>
-              <w:rPr>
-                <w:rFonts w:ascii="Calibri" w:eastAsia="Times New Roman" w:hAnsi="Calibri" w:cs="Calibri"/>
-                <w:sz w:val="22"/>
-                <w:szCs w:val="22"/>
-              </w:rPr>
-              <w:t>Rien</w:t>
+              <w:t>Réajustement mensuel</w:t>
+            </w:r>
+          </w:p>
+        </w:tc>
+        <w:tc>
+          <w:tcPr>
+            <w:tcW w:w="0" w:type="auto"/>
+            <w:tcBorders>
+              <w:top w:val="single" w:sz="6" w:space="0" w:color="9CB0CE"/>
+              <w:left w:val="single" w:sz="6" w:space="0" w:color="9CB0CE"/>
+              <w:bottom w:val="single" w:sz="6" w:space="0" w:color="9CB0CE"/>
+              <w:right w:val="single" w:sz="6" w:space="0" w:color="9CB0CE"/>
+            </w:tcBorders>
+            <w:tcMar>
+              <w:top w:w="100" w:type="dxa"/>
+              <w:left w:w="140" w:type="dxa"/>
+              <w:bottom w:w="100" w:type="dxa"/>
+              <w:right w:w="140" w:type="dxa"/>
+            </w:tcMar>
+            <w:hideMark/>
+          </w:tcPr>
+          <w:p>
+            <w:pPr>
+              <w:spacing w:before="160" w:after="160"/>
+              <w:rPr>
+                <w:rFonts w:ascii="Calibri" w:eastAsia="Times New Roman" w:hAnsi="Calibri" w:cs="Calibri"/>
+                <w:sz w:val="22"/>
+                <w:szCs w:val="22"/>
+              </w:rPr>
+            </w:pPr>
+            <w:r>
+              <w:rPr>
+                <w:rFonts w:ascii="Calibri" w:eastAsia="Times New Roman" w:hAnsi="Calibri" w:cs="Calibri"/>
+                <w:sz w:val="22"/>
+                <w:szCs w:val="22"/>
+              </w:rPr>
+              <w:t>Au premier passage du mois</w:t>
+            </w:r>
+          </w:p>
+        </w:tc>
+        <w:tc>
+          <w:tcPr>
+            <w:tcW w:w="0" w:type="auto"/>
+            <w:tcBorders>
+              <w:top w:val="single" w:sz="6" w:space="0" w:color="9CB0CE"/>
+              <w:left w:val="single" w:sz="6" w:space="0" w:color="9CB0CE"/>
+              <w:bottom w:val="single" w:sz="6" w:space="0" w:color="9CB0CE"/>
+              <w:right w:val="single" w:sz="6" w:space="0" w:color="9CB0CE"/>
+            </w:tcBorders>
+            <w:tcMar>
+              <w:top w:w="100" w:type="dxa"/>
+              <w:left w:w="140" w:type="dxa"/>
+              <w:bottom w:w="100" w:type="dxa"/>
+              <w:right w:w="140" w:type="dxa"/>
+            </w:tcMar>
+            <w:hideMark/>
+          </w:tcPr>
+          <w:p>
+            <w:pPr>
+              <w:spacing w:before="160" w:after="160"/>
+              <w:rPr>
+                <w:rFonts w:ascii="Calibri" w:eastAsia="Times New Roman" w:hAnsi="Calibri" w:cs="Calibri"/>
+                <w:sz w:val="22"/>
+                <w:szCs w:val="22"/>
+              </w:rPr>
+            </w:pPr>
+            <w:r>
+              <w:rPr>
+                <w:rFonts w:ascii="Calibri" w:eastAsia="Times New Roman" w:hAnsi="Calibri" w:cs="Calibri"/>
+                <w:sz w:val="22"/>
+                <w:szCs w:val="22"/>
+              </w:rPr>
+              <w:t>Automatique — mais uniquement si un budget mensuel est défini.</w:t>
             </w:r>
           </w:p>
         </w:tc>
@@ -2326,96 +2939,1217 @@
     </w:tbl>
     <w:p>
       <w:pPr>
+        <w:pStyle w:val="Titre3"/>
+        <w:rPr>
+          <w:rFonts w:eastAsia="Times New Roman"/>
+        </w:rPr>
+      </w:pPr>
+      <w:r>
+        <w:rPr>
+          <w:rFonts w:eastAsia="Times New Roman"/>
+        </w:rPr>
+        <w:t>3.1 Le cycle d'une demande de recharge</w:t>
+      </w:r>
+    </w:p>
+    <w:p>
+      <w:pPr>
         <w:pStyle w:val="NormalWeb"/>
       </w:pPr>
       <w:r>
-        <w:t xml:space="preserve">Conséquence à bien avoir en tête : </w:t>
+        <w:lastRenderedPageBreak/>
+        <w:t xml:space="preserve">Une demande naît au statut </w:t>
       </w:r>
       <w:r>
         <w:rPr>
           <w:b/>
           <w:bCs/>
         </w:rPr>
-        <w:t>ce qui n'a pas été dépensé n'est pas conservé.</w:t>
-      </w:r>
-      <w:r>
-        <w:t xml:space="preserve"> Une direction qui n'utilise que la moitié de son budget ne commence pas le mois suivant avec une fois et demie son plafond. Elle repart du plafond.</w:t>
-      </w:r>
-    </w:p>
-    <w:p>
-      <w:pPr>
-        <w:pStyle w:val="Titre3"/>
-        <w:rPr>
-          <w:rFonts w:eastAsia="Times New Roman"/>
-        </w:rPr>
-      </w:pPr>
-      <w:r>
-        <w:rPr>
-          <w:rFonts w:eastAsia="Times New Roman"/>
-        </w:rPr>
-        <w:t>3.2 Comment le réajustement est déclenché</w:t>
-      </w:r>
-    </w:p>
-    <w:p>
-      <w:pPr>
-        <w:pStyle w:val="NormalWeb"/>
-      </w:pPr>
-      <w:r>
-        <w:t xml:space="preserve">Un traitement automatique tourne au démarrage du serveur, puis toutes les heures. Il ne </w:t>
-      </w:r>
-      <w:r>
-        <w:t>dépend d'aucun planificateur externe : si le serveur tourne, il tourne.</w:t>
-      </w:r>
-    </w:p>
-    <w:p>
-      <w:pPr>
-        <w:pStyle w:val="NormalWeb"/>
-      </w:pPr>
-      <w:r>
-        <w:t>Chaque portefeuille garde en mémoire le dernier mois où il a été réajusté. Le traitement peut donc s'exécuter des dizaines de fois par mois sans jamais recharger deux fois.</w:t>
-      </w:r>
-    </w:p>
-    <w:p>
-      <w:pPr>
-        <w:pStyle w:val="chemin"/>
-      </w:pPr>
-      <w:r>
-        <w:t>backend/src/modules/transactionnel/budget-mensuel.service.ts</w:t>
-      </w:r>
-    </w:p>
-    <w:p>
-      <w:pPr>
-        <w:pStyle w:val="Titre3"/>
-        <w:rPr>
-          <w:rFonts w:eastAsia="Times New Roman"/>
-        </w:rPr>
-      </w:pPr>
-      <w:r>
-        <w:rPr>
-          <w:rFonts w:eastAsia="Times New Roman"/>
-        </w:rPr>
-        <w:t>3.3 Quand la caisse source n'a pas de quoi recharger</w:t>
-      </w:r>
-    </w:p>
-    <w:p>
-      <w:pPr>
-        <w:pStyle w:val="NormalWeb"/>
-      </w:pPr>
-      <w:r>
-        <w:t xml:space="preserve">Le réajustement échoue, il est journalisé, et le mois </w:t>
-      </w:r>
-      <w:r>
-        <w:rPr>
+        <w:t>En attente</w:t>
+      </w:r>
+      <w:r>
+        <w:t>. Trois issues possibles :</w:t>
+      </w:r>
+    </w:p>
+    <w:p>
+      <w:pPr>
+        <w:numPr>
+          <w:ilvl w:val="0"/>
+          <w:numId w:val="1"/>
+        </w:numPr>
+        <w:spacing w:before="100" w:beforeAutospacing="1" w:after="100" w:afterAutospacing="1"/>
+        <w:rPr>
+          <w:rFonts w:eastAsia="Times New Roman"/>
+        </w:rPr>
+      </w:pPr>
+      <w:r>
+        <w:rPr>
+          <w:rFonts w:eastAsia="Times New Roman"/>
           <w:b/>
           <w:bCs/>
         </w:rPr>
+        <w:t>Traitée</w:t>
+      </w:r>
+      <w:r>
+        <w:rPr>
+          <w:rFonts w:eastAsia="Times New Roman"/>
+        </w:rPr>
+        <w:t xml:space="preserve"> par un caissier — l'argent passe de la caisse source au portefeuille ;</w:t>
+      </w:r>
+    </w:p>
+    <w:p>
+      <w:pPr>
+        <w:numPr>
+          <w:ilvl w:val="0"/>
+          <w:numId w:val="1"/>
+        </w:numPr>
+        <w:spacing w:before="100" w:beforeAutospacing="1" w:after="100" w:afterAutospacing="1"/>
+        <w:rPr>
+          <w:rFonts w:eastAsia="Times New Roman"/>
+        </w:rPr>
+      </w:pPr>
+      <w:r>
+        <w:rPr>
+          <w:rFonts w:eastAsia="Times New Roman"/>
+          <w:b/>
+          <w:bCs/>
+        </w:rPr>
+        <w:t>Rejetée</w:t>
+      </w:r>
+      <w:r>
+        <w:rPr>
+          <w:rFonts w:eastAsia="Times New Roman"/>
+        </w:rPr>
+        <w:t xml:space="preserve"> par un caissier, avec un commentaire ;</w:t>
+      </w:r>
+    </w:p>
+    <w:p>
+      <w:pPr>
+        <w:numPr>
+          <w:ilvl w:val="0"/>
+          <w:numId w:val="1"/>
+        </w:numPr>
+        <w:spacing w:before="100" w:beforeAutospacing="1" w:after="100" w:afterAutospacing="1"/>
+        <w:rPr>
+          <w:rFonts w:eastAsia="Times New Roman"/>
+        </w:rPr>
+      </w:pPr>
+      <w:r>
+        <w:rPr>
+          <w:rFonts w:eastAsia="Times New Roman"/>
+          <w:b/>
+          <w:bCs/>
+        </w:rPr>
+        <w:t>Annulée</w:t>
+      </w:r>
+      <w:r>
+        <w:rPr>
+          <w:rFonts w:eastAsia="Times New Roman"/>
+        </w:rPr>
+        <w:t xml:space="preserve"> par le demandeur lui-même.</w:t>
+      </w:r>
+    </w:p>
+    <w:p>
+      <w:pPr>
+        <w:pStyle w:val="NormalWeb"/>
+      </w:pPr>
+      <w:r>
+        <w:t>Une demande déjà traitée, rejetée ou annulée ne peut plus changer d'état : le message le dit explicitement plutôt que de laisser une deuxième recharge passer.</w:t>
+      </w:r>
+    </w:p>
+    <w:p>
+      <w:pPr>
+        <w:pStyle w:val="Titre2"/>
+        <w:rPr>
+          <w:rFonts w:eastAsia="Times New Roman"/>
+        </w:rPr>
+      </w:pPr>
+      <w:r>
+        <w:rPr>
+          <w:rFonts w:eastAsia="Times New Roman"/>
+        </w:rPr>
+        <w:t>4. Le budget mensuel</w:t>
+      </w:r>
+    </w:p>
+    <w:p>
+      <w:pPr>
+        <w:pStyle w:val="Titre3"/>
+        <w:rPr>
+          <w:rFonts w:eastAsia="Times New Roman"/>
+        </w:rPr>
+      </w:pPr>
+      <w:r>
+        <w:rPr>
+          <w:rFonts w:eastAsia="Times New Roman"/>
+        </w:rPr>
+        <w:t>4.1 Le principe : on ramène le portefeuille à son plafond</w:t>
+      </w:r>
+    </w:p>
+    <w:p>
+      <w:pPr>
+        <w:pStyle w:val="NormalWeb"/>
+      </w:pPr>
+      <w:r>
+        <w:t xml:space="preserve">Au passage dans un nouveau mois, le portefeuille est ramené </w:t>
+      </w:r>
+      <w:r>
+        <w:rPr>
+          <w:b/>
+          <w:bCs/>
+        </w:rPr>
+        <w:t>exactement</w:t>
+      </w:r>
+      <w:r>
+        <w:t xml:space="preserve"> à son plafond. Le calcul est une simple différence :</w:t>
+      </w:r>
+    </w:p>
+    <w:p>
+      <w:pPr>
+        <w:pStyle w:val="NormalWeb"/>
+        <w:ind w:left="400"/>
+      </w:pPr>
+      <w:r>
+        <w:rPr>
+          <w:b/>
+          <w:bCs/>
+        </w:rPr>
+        <w:t>écart = plafond − solde actuel</w:t>
+      </w:r>
+    </w:p>
+    <w:tbl>
+      <w:tblPr>
+        <w:tblW w:w="5000" w:type="pct"/>
+        <w:tblCellMar>
+          <w:top w:w="15" w:type="dxa"/>
+          <w:left w:w="15" w:type="dxa"/>
+          <w:bottom w:w="15" w:type="dxa"/>
+          <w:right w:w="15" w:type="dxa"/>
+        </w:tblCellMar>
+        <w:tblLook w:val="04A0" w:firstRow="1" w:lastRow="0" w:firstColumn="1" w:lastColumn="0" w:noHBand="0" w:noVBand="1"/>
+      </w:tblPr>
+      <w:tblGrid>
+        <w:gridCol w:w="2744"/>
+        <w:gridCol w:w="6312"/>
+      </w:tblGrid>
+      <w:tr>
+        <w:tc>
+          <w:tcPr>
+            <w:tcW w:w="0" w:type="auto"/>
+            <w:tcBorders>
+              <w:top w:val="single" w:sz="6" w:space="0" w:color="9CB0CE"/>
+              <w:left w:val="single" w:sz="6" w:space="0" w:color="9CB0CE"/>
+              <w:bottom w:val="single" w:sz="6" w:space="0" w:color="9CB0CE"/>
+              <w:right w:val="single" w:sz="6" w:space="0" w:color="9CB0CE"/>
+            </w:tcBorders>
+            <w:shd w:val="clear" w:color="auto" w:fill="DEE6F0"/>
+            <w:tcMar>
+              <w:top w:w="100" w:type="dxa"/>
+              <w:left w:w="140" w:type="dxa"/>
+              <w:bottom w:w="100" w:type="dxa"/>
+              <w:right w:w="140" w:type="dxa"/>
+            </w:tcMar>
+            <w:hideMark/>
+          </w:tcPr>
+          <w:p>
+            <w:pPr>
+              <w:spacing w:before="160" w:after="160"/>
+              <w:rPr>
+                <w:rFonts w:ascii="Calibri" w:eastAsia="Times New Roman" w:hAnsi="Calibri" w:cs="Calibri"/>
+                <w:b/>
+                <w:bCs/>
+                <w:sz w:val="22"/>
+                <w:szCs w:val="22"/>
+              </w:rPr>
+            </w:pPr>
+            <w:r>
+              <w:rPr>
+                <w:rFonts w:ascii="Calibri" w:eastAsia="Times New Roman" w:hAnsi="Calibri" w:cs="Calibri"/>
+                <w:b/>
+                <w:bCs/>
+                <w:sz w:val="22"/>
+                <w:szCs w:val="22"/>
+              </w:rPr>
+              <w:t>Situation</w:t>
+            </w:r>
+          </w:p>
+        </w:tc>
+        <w:tc>
+          <w:tcPr>
+            <w:tcW w:w="0" w:type="auto"/>
+            <w:tcBorders>
+              <w:top w:val="single" w:sz="6" w:space="0" w:color="9CB0CE"/>
+              <w:left w:val="single" w:sz="6" w:space="0" w:color="9CB0CE"/>
+              <w:bottom w:val="single" w:sz="6" w:space="0" w:color="9CB0CE"/>
+              <w:right w:val="single" w:sz="6" w:space="0" w:color="9CB0CE"/>
+            </w:tcBorders>
+            <w:shd w:val="clear" w:color="auto" w:fill="DEE6F0"/>
+            <w:tcMar>
+              <w:top w:w="100" w:type="dxa"/>
+              <w:left w:w="140" w:type="dxa"/>
+              <w:bottom w:w="100" w:type="dxa"/>
+              <w:right w:w="140" w:type="dxa"/>
+            </w:tcMar>
+            <w:hideMark/>
+          </w:tcPr>
+          <w:p>
+            <w:pPr>
+              <w:spacing w:before="160" w:after="160"/>
+              <w:rPr>
+                <w:rFonts w:ascii="Calibri" w:eastAsia="Times New Roman" w:hAnsi="Calibri" w:cs="Calibri"/>
+                <w:b/>
+                <w:bCs/>
+                <w:sz w:val="22"/>
+                <w:szCs w:val="22"/>
+              </w:rPr>
+            </w:pPr>
+            <w:r>
+              <w:rPr>
+                <w:rFonts w:ascii="Calibri" w:eastAsia="Times New Roman" w:hAnsi="Calibri" w:cs="Calibri"/>
+                <w:b/>
+                <w:bCs/>
+                <w:sz w:val="22"/>
+                <w:szCs w:val="22"/>
+              </w:rPr>
+              <w:t>Ce qui se passe</w:t>
+            </w:r>
+          </w:p>
+        </w:tc>
+      </w:tr>
+      <w:tr>
+        <w:tc>
+          <w:tcPr>
+            <w:tcW w:w="0" w:type="auto"/>
+            <w:tcBorders>
+              <w:top w:val="single" w:sz="6" w:space="0" w:color="9CB0CE"/>
+              <w:left w:val="single" w:sz="6" w:space="0" w:color="9CB0CE"/>
+              <w:bottom w:val="single" w:sz="6" w:space="0" w:color="9CB0CE"/>
+              <w:right w:val="single" w:sz="6" w:space="0" w:color="9CB0CE"/>
+            </w:tcBorders>
+            <w:tcMar>
+              <w:top w:w="100" w:type="dxa"/>
+              <w:left w:w="140" w:type="dxa"/>
+              <w:bottom w:w="100" w:type="dxa"/>
+              <w:right w:w="140" w:type="dxa"/>
+            </w:tcMar>
+            <w:hideMark/>
+          </w:tcPr>
+          <w:p>
+            <w:pPr>
+              <w:spacing w:before="160" w:after="160"/>
+              <w:rPr>
+                <w:rFonts w:ascii="Calibri" w:eastAsia="Times New Roman" w:hAnsi="Calibri" w:cs="Calibri"/>
+                <w:sz w:val="22"/>
+                <w:szCs w:val="22"/>
+              </w:rPr>
+            </w:pPr>
+            <w:r>
+              <w:rPr>
+                <w:rFonts w:ascii="Calibri" w:eastAsia="Times New Roman" w:hAnsi="Calibri" w:cs="Calibri"/>
+                <w:sz w:val="22"/>
+                <w:szCs w:val="22"/>
+              </w:rPr>
+              <w:t xml:space="preserve">Solde </w:t>
+            </w:r>
+            <w:r>
+              <w:rPr>
+                <w:rFonts w:ascii="Calibri" w:eastAsia="Times New Roman" w:hAnsi="Calibri" w:cs="Calibri"/>
+                <w:b/>
+                <w:bCs/>
+                <w:sz w:val="22"/>
+                <w:szCs w:val="22"/>
+              </w:rPr>
+              <w:t>en dessous</w:t>
+            </w:r>
+            <w:r>
+              <w:rPr>
+                <w:rFonts w:ascii="Calibri" w:eastAsia="Times New Roman" w:hAnsi="Calibri" w:cs="Calibri"/>
+                <w:sz w:val="22"/>
+                <w:szCs w:val="22"/>
+              </w:rPr>
+              <w:t xml:space="preserve"> du plafond</w:t>
+            </w:r>
+          </w:p>
+        </w:tc>
+        <w:tc>
+          <w:tcPr>
+            <w:tcW w:w="0" w:type="auto"/>
+            <w:tcBorders>
+              <w:top w:val="single" w:sz="6" w:space="0" w:color="9CB0CE"/>
+              <w:left w:val="single" w:sz="6" w:space="0" w:color="9CB0CE"/>
+              <w:bottom w:val="single" w:sz="6" w:space="0" w:color="9CB0CE"/>
+              <w:right w:val="single" w:sz="6" w:space="0" w:color="9CB0CE"/>
+            </w:tcBorders>
+            <w:tcMar>
+              <w:top w:w="100" w:type="dxa"/>
+              <w:left w:w="140" w:type="dxa"/>
+              <w:bottom w:w="100" w:type="dxa"/>
+              <w:right w:w="140" w:type="dxa"/>
+            </w:tcMar>
+            <w:hideMark/>
+          </w:tcPr>
+          <w:p>
+            <w:pPr>
+              <w:spacing w:before="160" w:after="160"/>
+              <w:rPr>
+                <w:rFonts w:ascii="Calibri" w:eastAsia="Times New Roman" w:hAnsi="Calibri" w:cs="Calibri"/>
+                <w:sz w:val="22"/>
+                <w:szCs w:val="22"/>
+              </w:rPr>
+            </w:pPr>
+            <w:r>
+              <w:rPr>
+                <w:rFonts w:ascii="Calibri" w:eastAsia="Times New Roman" w:hAnsi="Calibri" w:cs="Calibri"/>
+                <w:sz w:val="22"/>
+                <w:szCs w:val="22"/>
+              </w:rPr>
+              <w:t>Recharge de l'écart : la caisse source est débitée, le portefeuille crédité</w:t>
+            </w:r>
+          </w:p>
+        </w:tc>
+      </w:tr>
+      <w:tr>
+        <w:tc>
+          <w:tcPr>
+            <w:tcW w:w="0" w:type="auto"/>
+            <w:tcBorders>
+              <w:top w:val="single" w:sz="6" w:space="0" w:color="9CB0CE"/>
+              <w:left w:val="single" w:sz="6" w:space="0" w:color="9CB0CE"/>
+              <w:bottom w:val="single" w:sz="6" w:space="0" w:color="9CB0CE"/>
+              <w:right w:val="single" w:sz="6" w:space="0" w:color="9CB0CE"/>
+            </w:tcBorders>
+            <w:tcMar>
+              <w:top w:w="100" w:type="dxa"/>
+              <w:left w:w="140" w:type="dxa"/>
+              <w:bottom w:w="100" w:type="dxa"/>
+              <w:right w:w="140" w:type="dxa"/>
+            </w:tcMar>
+            <w:hideMark/>
+          </w:tcPr>
+          <w:p>
+            <w:pPr>
+              <w:spacing w:before="160" w:after="160"/>
+              <w:rPr>
+                <w:rFonts w:ascii="Calibri" w:eastAsia="Times New Roman" w:hAnsi="Calibri" w:cs="Calibri"/>
+                <w:sz w:val="22"/>
+                <w:szCs w:val="22"/>
+              </w:rPr>
+            </w:pPr>
+            <w:r>
+              <w:rPr>
+                <w:rFonts w:ascii="Calibri" w:eastAsia="Times New Roman" w:hAnsi="Calibri" w:cs="Calibri"/>
+                <w:sz w:val="22"/>
+                <w:szCs w:val="22"/>
+              </w:rPr>
+              <w:t xml:space="preserve">Solde </w:t>
+            </w:r>
+            <w:r>
+              <w:rPr>
+                <w:rFonts w:ascii="Calibri" w:eastAsia="Times New Roman" w:hAnsi="Calibri" w:cs="Calibri"/>
+                <w:b/>
+                <w:bCs/>
+                <w:sz w:val="22"/>
+                <w:szCs w:val="22"/>
+              </w:rPr>
+              <w:t>au-dessus</w:t>
+            </w:r>
+            <w:r>
+              <w:rPr>
+                <w:rFonts w:ascii="Calibri" w:eastAsia="Times New Roman" w:hAnsi="Calibri" w:cs="Calibri"/>
+                <w:sz w:val="22"/>
+                <w:szCs w:val="22"/>
+              </w:rPr>
+              <w:t xml:space="preserve"> du plafond</w:t>
+            </w:r>
+          </w:p>
+        </w:tc>
+        <w:tc>
+          <w:tcPr>
+            <w:tcW w:w="0" w:type="auto"/>
+            <w:tcBorders>
+              <w:top w:val="single" w:sz="6" w:space="0" w:color="9CB0CE"/>
+              <w:left w:val="single" w:sz="6" w:space="0" w:color="9CB0CE"/>
+              <w:bottom w:val="single" w:sz="6" w:space="0" w:color="9CB0CE"/>
+              <w:right w:val="single" w:sz="6" w:space="0" w:color="9CB0CE"/>
+            </w:tcBorders>
+            <w:tcMar>
+              <w:top w:w="100" w:type="dxa"/>
+              <w:left w:w="140" w:type="dxa"/>
+              <w:bottom w:w="100" w:type="dxa"/>
+              <w:right w:w="140" w:type="dxa"/>
+            </w:tcMar>
+            <w:hideMark/>
+          </w:tcPr>
+          <w:p>
+            <w:pPr>
+              <w:spacing w:before="160" w:after="160"/>
+              <w:rPr>
+                <w:rFonts w:ascii="Calibri" w:eastAsia="Times New Roman" w:hAnsi="Calibri" w:cs="Calibri"/>
+                <w:sz w:val="22"/>
+                <w:szCs w:val="22"/>
+              </w:rPr>
+            </w:pPr>
+            <w:r>
+              <w:rPr>
+                <w:rFonts w:ascii="Calibri" w:eastAsia="Times New Roman" w:hAnsi="Calibri" w:cs="Calibri"/>
+                <w:sz w:val="22"/>
+                <w:szCs w:val="22"/>
+              </w:rPr>
+              <w:t>Reprise du surplus : le portefeuille est débité, la caisse recréditée</w:t>
+            </w:r>
+          </w:p>
+        </w:tc>
+      </w:tr>
+      <w:tr>
+        <w:tc>
+          <w:tcPr>
+            <w:tcW w:w="0" w:type="auto"/>
+            <w:tcBorders>
+              <w:top w:val="single" w:sz="6" w:space="0" w:color="9CB0CE"/>
+              <w:left w:val="single" w:sz="6" w:space="0" w:color="9CB0CE"/>
+              <w:bottom w:val="single" w:sz="6" w:space="0" w:color="9CB0CE"/>
+              <w:right w:val="single" w:sz="6" w:space="0" w:color="9CB0CE"/>
+            </w:tcBorders>
+            <w:tcMar>
+              <w:top w:w="100" w:type="dxa"/>
+              <w:left w:w="140" w:type="dxa"/>
+              <w:bottom w:w="100" w:type="dxa"/>
+              <w:right w:w="140" w:type="dxa"/>
+            </w:tcMar>
+            <w:hideMark/>
+          </w:tcPr>
+          <w:p>
+            <w:pPr>
+              <w:spacing w:before="160" w:after="160"/>
+              <w:rPr>
+                <w:rFonts w:ascii="Calibri" w:eastAsia="Times New Roman" w:hAnsi="Calibri" w:cs="Calibri"/>
+                <w:sz w:val="22"/>
+                <w:szCs w:val="22"/>
+              </w:rPr>
+            </w:pPr>
+            <w:r>
+              <w:rPr>
+                <w:rFonts w:ascii="Calibri" w:eastAsia="Times New Roman" w:hAnsi="Calibri" w:cs="Calibri"/>
+                <w:sz w:val="22"/>
+                <w:szCs w:val="22"/>
+              </w:rPr>
+              <w:t xml:space="preserve">Solde </w:t>
+            </w:r>
+            <w:r>
+              <w:rPr>
+                <w:rFonts w:ascii="Calibri" w:eastAsia="Times New Roman" w:hAnsi="Calibri" w:cs="Calibri"/>
+                <w:b/>
+                <w:bCs/>
+                <w:sz w:val="22"/>
+                <w:szCs w:val="22"/>
+              </w:rPr>
+              <w:t>égal</w:t>
+            </w:r>
+            <w:r>
+              <w:rPr>
+                <w:rFonts w:ascii="Calibri" w:eastAsia="Times New Roman" w:hAnsi="Calibri" w:cs="Calibri"/>
+                <w:sz w:val="22"/>
+                <w:szCs w:val="22"/>
+              </w:rPr>
+              <w:t xml:space="preserve"> au plafond</w:t>
+            </w:r>
+          </w:p>
+        </w:tc>
+        <w:tc>
+          <w:tcPr>
+            <w:tcW w:w="0" w:type="auto"/>
+            <w:tcBorders>
+              <w:top w:val="single" w:sz="6" w:space="0" w:color="9CB0CE"/>
+              <w:left w:val="single" w:sz="6" w:space="0" w:color="9CB0CE"/>
+              <w:bottom w:val="single" w:sz="6" w:space="0" w:color="9CB0CE"/>
+              <w:right w:val="single" w:sz="6" w:space="0" w:color="9CB0CE"/>
+            </w:tcBorders>
+            <w:tcMar>
+              <w:top w:w="100" w:type="dxa"/>
+              <w:left w:w="140" w:type="dxa"/>
+              <w:bottom w:w="100" w:type="dxa"/>
+              <w:right w:w="140" w:type="dxa"/>
+            </w:tcMar>
+            <w:hideMark/>
+          </w:tcPr>
+          <w:p>
+            <w:pPr>
+              <w:spacing w:before="160" w:after="160"/>
+              <w:rPr>
+                <w:rFonts w:ascii="Calibri" w:eastAsia="Times New Roman" w:hAnsi="Calibri" w:cs="Calibri"/>
+                <w:sz w:val="22"/>
+                <w:szCs w:val="22"/>
+              </w:rPr>
+            </w:pPr>
+            <w:r>
+              <w:rPr>
+                <w:rFonts w:ascii="Calibri" w:eastAsia="Times New Roman" w:hAnsi="Calibri" w:cs="Calibri"/>
+                <w:sz w:val="22"/>
+                <w:szCs w:val="22"/>
+              </w:rPr>
+              <w:t>Rien du tout</w:t>
+            </w:r>
+          </w:p>
+        </w:tc>
+      </w:tr>
+    </w:tbl>
+    <w:p>
+      <w:pPr>
+        <w:pStyle w:val="Titre3"/>
+        <w:shd w:val="clear" w:color="auto" w:fill="EBF5EC"/>
+        <w:spacing w:before="0"/>
+        <w:divId w:val="518082215"/>
+        <w:rPr>
+          <w:rFonts w:eastAsia="Times New Roman"/>
+        </w:rPr>
+      </w:pPr>
+      <w:r>
+        <w:rPr>
+          <w:rFonts w:eastAsia="Times New Roman"/>
+        </w:rPr>
+        <w:t>4.2 Ce qui n'a pas été dépensé n'est PAS perdu</w:t>
+      </w:r>
+    </w:p>
+    <w:p>
+      <w:pPr>
+        <w:pStyle w:val="NormalWeb"/>
+        <w:shd w:val="clear" w:color="auto" w:fill="EBF5EC"/>
+        <w:divId w:val="518082215"/>
+      </w:pPr>
+      <w:r>
+        <w:t>C'est la question qui revient toujours, et la réponse est non. Prenons un plafond de 500 000 :</w:t>
+      </w:r>
+    </w:p>
+    <w:tbl>
+      <w:tblPr>
+        <w:tblW w:w="5000" w:type="pct"/>
+        <w:tblCellMar>
+          <w:top w:w="15" w:type="dxa"/>
+          <w:left w:w="15" w:type="dxa"/>
+          <w:bottom w:w="15" w:type="dxa"/>
+          <w:right w:w="15" w:type="dxa"/>
+        </w:tblCellMar>
+        <w:tblLook w:val="04A0" w:firstRow="1" w:lastRow="0" w:firstColumn="1" w:lastColumn="0" w:noHBand="0" w:noVBand="1"/>
+      </w:tblPr>
+      <w:tblGrid>
+        <w:gridCol w:w="2977"/>
+        <w:gridCol w:w="1463"/>
+        <w:gridCol w:w="4616"/>
+      </w:tblGrid>
+      <w:tr>
+        <w:trPr>
+          <w:divId w:val="518082215"/>
+        </w:trPr>
+        <w:tc>
+          <w:tcPr>
+            <w:tcW w:w="0" w:type="auto"/>
+            <w:tcBorders>
+              <w:top w:val="single" w:sz="6" w:space="0" w:color="9CB0CE"/>
+              <w:left w:val="single" w:sz="6" w:space="0" w:color="9CB0CE"/>
+              <w:bottom w:val="single" w:sz="6" w:space="0" w:color="9CB0CE"/>
+              <w:right w:val="single" w:sz="6" w:space="0" w:color="9CB0CE"/>
+            </w:tcBorders>
+            <w:shd w:val="clear" w:color="auto" w:fill="DEE6F0"/>
+            <w:tcMar>
+              <w:top w:w="100" w:type="dxa"/>
+              <w:left w:w="140" w:type="dxa"/>
+              <w:bottom w:w="100" w:type="dxa"/>
+              <w:right w:w="140" w:type="dxa"/>
+            </w:tcMar>
+            <w:hideMark/>
+          </w:tcPr>
+          <w:p>
+            <w:pPr>
+              <w:spacing w:before="160" w:after="160"/>
+              <w:rPr>
+                <w:rFonts w:ascii="Calibri" w:eastAsia="Times New Roman" w:hAnsi="Calibri" w:cs="Calibri"/>
+                <w:b/>
+                <w:bCs/>
+                <w:sz w:val="22"/>
+                <w:szCs w:val="22"/>
+              </w:rPr>
+            </w:pPr>
+            <w:r>
+              <w:rPr>
+                <w:rFonts w:ascii="Calibri" w:eastAsia="Times New Roman" w:hAnsi="Calibri" w:cs="Calibri"/>
+                <w:b/>
+                <w:bCs/>
+                <w:sz w:val="22"/>
+                <w:szCs w:val="22"/>
+              </w:rPr>
+              <w:t>Moment</w:t>
+            </w:r>
+          </w:p>
+        </w:tc>
+        <w:tc>
+          <w:tcPr>
+            <w:tcW w:w="0" w:type="auto"/>
+            <w:tcBorders>
+              <w:top w:val="single" w:sz="6" w:space="0" w:color="9CB0CE"/>
+              <w:left w:val="single" w:sz="6" w:space="0" w:color="9CB0CE"/>
+              <w:bottom w:val="single" w:sz="6" w:space="0" w:color="9CB0CE"/>
+              <w:right w:val="single" w:sz="6" w:space="0" w:color="9CB0CE"/>
+            </w:tcBorders>
+            <w:shd w:val="clear" w:color="auto" w:fill="DEE6F0"/>
+            <w:tcMar>
+              <w:top w:w="100" w:type="dxa"/>
+              <w:left w:w="140" w:type="dxa"/>
+              <w:bottom w:w="100" w:type="dxa"/>
+              <w:right w:w="140" w:type="dxa"/>
+            </w:tcMar>
+            <w:hideMark/>
+          </w:tcPr>
+          <w:p>
+            <w:pPr>
+              <w:spacing w:before="160" w:after="160"/>
+              <w:rPr>
+                <w:rFonts w:ascii="Calibri" w:eastAsia="Times New Roman" w:hAnsi="Calibri" w:cs="Calibri"/>
+                <w:b/>
+                <w:bCs/>
+                <w:sz w:val="22"/>
+                <w:szCs w:val="22"/>
+              </w:rPr>
+            </w:pPr>
+            <w:r>
+              <w:rPr>
+                <w:rFonts w:ascii="Calibri" w:eastAsia="Times New Roman" w:hAnsi="Calibri" w:cs="Calibri"/>
+                <w:b/>
+                <w:bCs/>
+                <w:sz w:val="22"/>
+                <w:szCs w:val="22"/>
+              </w:rPr>
+              <w:t>Solde</w:t>
+            </w:r>
+          </w:p>
+        </w:tc>
+        <w:tc>
+          <w:tcPr>
+            <w:tcW w:w="0" w:type="auto"/>
+            <w:tcBorders>
+              <w:top w:val="single" w:sz="6" w:space="0" w:color="9CB0CE"/>
+              <w:left w:val="single" w:sz="6" w:space="0" w:color="9CB0CE"/>
+              <w:bottom w:val="single" w:sz="6" w:space="0" w:color="9CB0CE"/>
+              <w:right w:val="single" w:sz="6" w:space="0" w:color="9CB0CE"/>
+            </w:tcBorders>
+            <w:shd w:val="clear" w:color="auto" w:fill="DEE6F0"/>
+            <w:tcMar>
+              <w:top w:w="100" w:type="dxa"/>
+              <w:left w:w="140" w:type="dxa"/>
+              <w:bottom w:w="100" w:type="dxa"/>
+              <w:right w:w="140" w:type="dxa"/>
+            </w:tcMar>
+            <w:hideMark/>
+          </w:tcPr>
+          <w:p>
+            <w:pPr>
+              <w:spacing w:before="160" w:after="160"/>
+              <w:rPr>
+                <w:rFonts w:ascii="Calibri" w:eastAsia="Times New Roman" w:hAnsi="Calibri" w:cs="Calibri"/>
+                <w:b/>
+                <w:bCs/>
+                <w:sz w:val="22"/>
+                <w:szCs w:val="22"/>
+              </w:rPr>
+            </w:pPr>
+            <w:r>
+              <w:rPr>
+                <w:rFonts w:ascii="Calibri" w:eastAsia="Times New Roman" w:hAnsi="Calibri" w:cs="Calibri"/>
+                <w:b/>
+                <w:bCs/>
+                <w:sz w:val="22"/>
+                <w:szCs w:val="22"/>
+              </w:rPr>
+              <w:t>Mouvement</w:t>
+            </w:r>
+          </w:p>
+        </w:tc>
+      </w:tr>
+      <w:tr>
+        <w:trPr>
+          <w:divId w:val="518082215"/>
+        </w:trPr>
+        <w:tc>
+          <w:tcPr>
+            <w:tcW w:w="0" w:type="auto"/>
+            <w:tcBorders>
+              <w:top w:val="single" w:sz="6" w:space="0" w:color="9CB0CE"/>
+              <w:left w:val="single" w:sz="6" w:space="0" w:color="9CB0CE"/>
+              <w:bottom w:val="single" w:sz="6" w:space="0" w:color="9CB0CE"/>
+              <w:right w:val="single" w:sz="6" w:space="0" w:color="9CB0CE"/>
+            </w:tcBorders>
+            <w:tcMar>
+              <w:top w:w="100" w:type="dxa"/>
+              <w:left w:w="140" w:type="dxa"/>
+              <w:bottom w:w="100" w:type="dxa"/>
+              <w:right w:w="140" w:type="dxa"/>
+            </w:tcMar>
+            <w:hideMark/>
+          </w:tcPr>
+          <w:p>
+            <w:pPr>
+              <w:spacing w:before="160" w:after="160"/>
+              <w:rPr>
+                <w:rFonts w:ascii="Calibri" w:eastAsia="Times New Roman" w:hAnsi="Calibri" w:cs="Calibri"/>
+                <w:sz w:val="22"/>
+                <w:szCs w:val="22"/>
+              </w:rPr>
+            </w:pPr>
+            <w:r>
+              <w:rPr>
+                <w:rFonts w:ascii="Calibri" w:eastAsia="Times New Roman" w:hAnsi="Calibri" w:cs="Calibri"/>
+                <w:sz w:val="22"/>
+                <w:szCs w:val="22"/>
+              </w:rPr>
+              <w:t>1er du mois</w:t>
+            </w:r>
+          </w:p>
+        </w:tc>
+        <w:tc>
+          <w:tcPr>
+            <w:tcW w:w="0" w:type="auto"/>
+            <w:tcBorders>
+              <w:top w:val="single" w:sz="6" w:space="0" w:color="9CB0CE"/>
+              <w:left w:val="single" w:sz="6" w:space="0" w:color="9CB0CE"/>
+              <w:bottom w:val="single" w:sz="6" w:space="0" w:color="9CB0CE"/>
+              <w:right w:val="single" w:sz="6" w:space="0" w:color="9CB0CE"/>
+            </w:tcBorders>
+            <w:tcMar>
+              <w:top w:w="100" w:type="dxa"/>
+              <w:left w:w="140" w:type="dxa"/>
+              <w:bottom w:w="100" w:type="dxa"/>
+              <w:right w:w="140" w:type="dxa"/>
+            </w:tcMar>
+            <w:hideMark/>
+          </w:tcPr>
+          <w:p>
+            <w:pPr>
+              <w:spacing w:before="160" w:after="160"/>
+              <w:rPr>
+                <w:rFonts w:ascii="Calibri" w:eastAsia="Times New Roman" w:hAnsi="Calibri" w:cs="Calibri"/>
+                <w:sz w:val="22"/>
+                <w:szCs w:val="22"/>
+              </w:rPr>
+            </w:pPr>
+            <w:r>
+              <w:rPr>
+                <w:rFonts w:ascii="Calibri" w:eastAsia="Times New Roman" w:hAnsi="Calibri" w:cs="Calibri"/>
+                <w:sz w:val="22"/>
+                <w:szCs w:val="22"/>
+              </w:rPr>
+              <w:t>500 000</w:t>
+            </w:r>
+          </w:p>
+        </w:tc>
+        <w:tc>
+          <w:tcPr>
+            <w:tcW w:w="0" w:type="auto"/>
+            <w:tcBorders>
+              <w:top w:val="single" w:sz="6" w:space="0" w:color="9CB0CE"/>
+              <w:left w:val="single" w:sz="6" w:space="0" w:color="9CB0CE"/>
+              <w:bottom w:val="single" w:sz="6" w:space="0" w:color="9CB0CE"/>
+              <w:right w:val="single" w:sz="6" w:space="0" w:color="9CB0CE"/>
+            </w:tcBorders>
+            <w:tcMar>
+              <w:top w:w="100" w:type="dxa"/>
+              <w:left w:w="140" w:type="dxa"/>
+              <w:bottom w:w="100" w:type="dxa"/>
+              <w:right w:w="140" w:type="dxa"/>
+            </w:tcMar>
+            <w:hideMark/>
+          </w:tcPr>
+          <w:p>
+            <w:pPr>
+              <w:spacing w:before="160" w:after="160"/>
+              <w:rPr>
+                <w:rFonts w:ascii="Calibri" w:eastAsia="Times New Roman" w:hAnsi="Calibri" w:cs="Calibri"/>
+                <w:sz w:val="22"/>
+                <w:szCs w:val="22"/>
+              </w:rPr>
+            </w:pPr>
+            <w:r>
+              <w:rPr>
+                <w:rFonts w:ascii="Calibri" w:eastAsia="Times New Roman" w:hAnsi="Calibri" w:cs="Calibri"/>
+                <w:sz w:val="22"/>
+                <w:szCs w:val="22"/>
+              </w:rPr>
+              <w:t>—</w:t>
+            </w:r>
+          </w:p>
+        </w:tc>
+      </w:tr>
+      <w:tr>
+        <w:trPr>
+          <w:divId w:val="518082215"/>
+        </w:trPr>
+        <w:tc>
+          <w:tcPr>
+            <w:tcW w:w="0" w:type="auto"/>
+            <w:tcBorders>
+              <w:top w:val="single" w:sz="6" w:space="0" w:color="9CB0CE"/>
+              <w:left w:val="single" w:sz="6" w:space="0" w:color="9CB0CE"/>
+              <w:bottom w:val="single" w:sz="6" w:space="0" w:color="9CB0CE"/>
+              <w:right w:val="single" w:sz="6" w:space="0" w:color="9CB0CE"/>
+            </w:tcBorders>
+            <w:tcMar>
+              <w:top w:w="100" w:type="dxa"/>
+              <w:left w:w="140" w:type="dxa"/>
+              <w:bottom w:w="100" w:type="dxa"/>
+              <w:right w:w="140" w:type="dxa"/>
+            </w:tcMar>
+            <w:hideMark/>
+          </w:tcPr>
+          <w:p>
+            <w:pPr>
+              <w:spacing w:before="160" w:after="160"/>
+              <w:rPr>
+                <w:rFonts w:ascii="Calibri" w:eastAsia="Times New Roman" w:hAnsi="Calibri" w:cs="Calibri"/>
+                <w:sz w:val="22"/>
+                <w:szCs w:val="22"/>
+              </w:rPr>
+            </w:pPr>
+            <w:r>
+              <w:rPr>
+                <w:rFonts w:ascii="Calibri" w:eastAsia="Times New Roman" w:hAnsi="Calibri" w:cs="Calibri"/>
+                <w:sz w:val="22"/>
+                <w:szCs w:val="22"/>
+              </w:rPr>
+              <w:t>Pendant le mois</w:t>
+            </w:r>
+          </w:p>
+        </w:tc>
+        <w:tc>
+          <w:tcPr>
+            <w:tcW w:w="0" w:type="auto"/>
+            <w:tcBorders>
+              <w:top w:val="single" w:sz="6" w:space="0" w:color="9CB0CE"/>
+              <w:left w:val="single" w:sz="6" w:space="0" w:color="9CB0CE"/>
+              <w:bottom w:val="single" w:sz="6" w:space="0" w:color="9CB0CE"/>
+              <w:right w:val="single" w:sz="6" w:space="0" w:color="9CB0CE"/>
+            </w:tcBorders>
+            <w:tcMar>
+              <w:top w:w="100" w:type="dxa"/>
+              <w:left w:w="140" w:type="dxa"/>
+              <w:bottom w:w="100" w:type="dxa"/>
+              <w:right w:w="140" w:type="dxa"/>
+            </w:tcMar>
+            <w:hideMark/>
+          </w:tcPr>
+          <w:p>
+            <w:pPr>
+              <w:spacing w:before="160" w:after="160"/>
+              <w:rPr>
+                <w:rFonts w:ascii="Calibri" w:eastAsia="Times New Roman" w:hAnsi="Calibri" w:cs="Calibri"/>
+                <w:sz w:val="22"/>
+                <w:szCs w:val="22"/>
+              </w:rPr>
+            </w:pPr>
+            <w:r>
+              <w:rPr>
+                <w:rFonts w:ascii="Calibri" w:eastAsia="Times New Roman" w:hAnsi="Calibri" w:cs="Calibri"/>
+                <w:sz w:val="22"/>
+                <w:szCs w:val="22"/>
+              </w:rPr>
+              <w:t>200 000</w:t>
+            </w:r>
+          </w:p>
+        </w:tc>
+        <w:tc>
+          <w:tcPr>
+            <w:tcW w:w="0" w:type="auto"/>
+            <w:tcBorders>
+              <w:top w:val="single" w:sz="6" w:space="0" w:color="9CB0CE"/>
+              <w:left w:val="single" w:sz="6" w:space="0" w:color="9CB0CE"/>
+              <w:bottom w:val="single" w:sz="6" w:space="0" w:color="9CB0CE"/>
+              <w:right w:val="single" w:sz="6" w:space="0" w:color="9CB0CE"/>
+            </w:tcBorders>
+            <w:tcMar>
+              <w:top w:w="100" w:type="dxa"/>
+              <w:left w:w="140" w:type="dxa"/>
+              <w:bottom w:w="100" w:type="dxa"/>
+              <w:right w:w="140" w:type="dxa"/>
+            </w:tcMar>
+            <w:hideMark/>
+          </w:tcPr>
+          <w:p>
+            <w:pPr>
+              <w:spacing w:before="160" w:after="160"/>
+              <w:rPr>
+                <w:rFonts w:ascii="Calibri" w:eastAsia="Times New Roman" w:hAnsi="Calibri" w:cs="Calibri"/>
+                <w:sz w:val="22"/>
+                <w:szCs w:val="22"/>
+              </w:rPr>
+            </w:pPr>
+            <w:r>
+              <w:rPr>
+                <w:rFonts w:ascii="Calibri" w:eastAsia="Times New Roman" w:hAnsi="Calibri" w:cs="Calibri"/>
+                <w:sz w:val="22"/>
+                <w:szCs w:val="22"/>
+              </w:rPr>
+              <w:t>300 000 dépensés</w:t>
+            </w:r>
+          </w:p>
+        </w:tc>
+      </w:tr>
+      <w:tr>
+        <w:trPr>
+          <w:divId w:val="518082215"/>
+        </w:trPr>
+        <w:tc>
+          <w:tcPr>
+            <w:tcW w:w="0" w:type="auto"/>
+            <w:tcBorders>
+              <w:top w:val="single" w:sz="6" w:space="0" w:color="9CB0CE"/>
+              <w:left w:val="single" w:sz="6" w:space="0" w:color="9CB0CE"/>
+              <w:bottom w:val="single" w:sz="6" w:space="0" w:color="9CB0CE"/>
+              <w:right w:val="single" w:sz="6" w:space="0" w:color="9CB0CE"/>
+            </w:tcBorders>
+            <w:tcMar>
+              <w:top w:w="100" w:type="dxa"/>
+              <w:left w:w="140" w:type="dxa"/>
+              <w:bottom w:w="100" w:type="dxa"/>
+              <w:right w:w="140" w:type="dxa"/>
+            </w:tcMar>
+            <w:hideMark/>
+          </w:tcPr>
+          <w:p>
+            <w:pPr>
+              <w:spacing w:before="160" w:after="160"/>
+              <w:rPr>
+                <w:rFonts w:ascii="Calibri" w:eastAsia="Times New Roman" w:hAnsi="Calibri" w:cs="Calibri"/>
+                <w:sz w:val="22"/>
+                <w:szCs w:val="22"/>
+              </w:rPr>
+            </w:pPr>
+            <w:r>
+              <w:rPr>
+                <w:rFonts w:ascii="Calibri" w:eastAsia="Times New Roman" w:hAnsi="Calibri" w:cs="Calibri"/>
+                <w:sz w:val="22"/>
+                <w:szCs w:val="22"/>
+              </w:rPr>
+              <w:t>1er du mois suivant</w:t>
+            </w:r>
+          </w:p>
+        </w:tc>
+        <w:tc>
+          <w:tcPr>
+            <w:tcW w:w="0" w:type="auto"/>
+            <w:tcBorders>
+              <w:top w:val="single" w:sz="6" w:space="0" w:color="9CB0CE"/>
+              <w:left w:val="single" w:sz="6" w:space="0" w:color="9CB0CE"/>
+              <w:bottom w:val="single" w:sz="6" w:space="0" w:color="9CB0CE"/>
+              <w:right w:val="single" w:sz="6" w:space="0" w:color="9CB0CE"/>
+            </w:tcBorders>
+            <w:tcMar>
+              <w:top w:w="100" w:type="dxa"/>
+              <w:left w:w="140" w:type="dxa"/>
+              <w:bottom w:w="100" w:type="dxa"/>
+              <w:right w:w="140" w:type="dxa"/>
+            </w:tcMar>
+            <w:hideMark/>
+          </w:tcPr>
+          <w:p>
+            <w:pPr>
+              <w:spacing w:before="160" w:after="160"/>
+              <w:rPr>
+                <w:rFonts w:ascii="Calibri" w:eastAsia="Times New Roman" w:hAnsi="Calibri" w:cs="Calibri"/>
+                <w:sz w:val="22"/>
+                <w:szCs w:val="22"/>
+              </w:rPr>
+            </w:pPr>
+            <w:r>
+              <w:rPr>
+                <w:rFonts w:ascii="Calibri" w:eastAsia="Times New Roman" w:hAnsi="Calibri" w:cs="Calibri"/>
+                <w:sz w:val="22"/>
+                <w:szCs w:val="22"/>
+              </w:rPr>
+              <w:t>500 000</w:t>
+            </w:r>
+          </w:p>
+        </w:tc>
+        <w:tc>
+          <w:tcPr>
+            <w:tcW w:w="0" w:type="auto"/>
+            <w:tcBorders>
+              <w:top w:val="single" w:sz="6" w:space="0" w:color="9CB0CE"/>
+              <w:left w:val="single" w:sz="6" w:space="0" w:color="9CB0CE"/>
+              <w:bottom w:val="single" w:sz="6" w:space="0" w:color="9CB0CE"/>
+              <w:right w:val="single" w:sz="6" w:space="0" w:color="9CB0CE"/>
+            </w:tcBorders>
+            <w:tcMar>
+              <w:top w:w="100" w:type="dxa"/>
+              <w:left w:w="140" w:type="dxa"/>
+              <w:bottom w:w="100" w:type="dxa"/>
+              <w:right w:w="140" w:type="dxa"/>
+            </w:tcMar>
+            <w:hideMark/>
+          </w:tcPr>
+          <w:p>
+            <w:pPr>
+              <w:spacing w:before="160" w:after="160"/>
+              <w:rPr>
+                <w:rFonts w:ascii="Calibri" w:eastAsia="Times New Roman" w:hAnsi="Calibri" w:cs="Calibri"/>
+                <w:sz w:val="22"/>
+                <w:szCs w:val="22"/>
+              </w:rPr>
+            </w:pPr>
+            <w:r>
+              <w:rPr>
+                <w:rFonts w:ascii="Calibri" w:eastAsia="Times New Roman" w:hAnsi="Calibri" w:cs="Calibri"/>
+                <w:sz w:val="22"/>
+                <w:szCs w:val="22"/>
+              </w:rPr>
+              <w:t xml:space="preserve">Recharge de </w:t>
+            </w:r>
+            <w:r>
+              <w:rPr>
+                <w:rFonts w:ascii="Calibri" w:eastAsia="Times New Roman" w:hAnsi="Calibri" w:cs="Calibri"/>
+                <w:b/>
+                <w:bCs/>
+                <w:sz w:val="22"/>
+                <w:szCs w:val="22"/>
+              </w:rPr>
+              <w:t>300 000</w:t>
+            </w:r>
+            <w:r>
+              <w:rPr>
+                <w:rFonts w:ascii="Calibri" w:eastAsia="Times New Roman" w:hAnsi="Calibri" w:cs="Calibri"/>
+                <w:sz w:val="22"/>
+                <w:szCs w:val="22"/>
+              </w:rPr>
+              <w:t xml:space="preserve"> </w:t>
+            </w:r>
+            <w:r>
+              <w:rPr>
+                <w:rFonts w:ascii="Calibri" w:eastAsia="Times New Roman" w:hAnsi="Calibri" w:cs="Calibri"/>
+                <w:sz w:val="22"/>
+                <w:szCs w:val="22"/>
+              </w:rPr>
+              <w:t>seulement</w:t>
+            </w:r>
+          </w:p>
+        </w:tc>
+      </w:tr>
+    </w:tbl>
+    <w:p>
+      <w:pPr>
+        <w:pStyle w:val="NormalWeb"/>
+        <w:shd w:val="clear" w:color="auto" w:fill="EBF5EC"/>
+        <w:divId w:val="518082215"/>
+      </w:pPr>
+      <w:r>
+        <w:lastRenderedPageBreak/>
+        <w:t xml:space="preserve">Les 200 000 non dépensés sont toujours dans le portefeuille. Ils viennent </w:t>
+      </w:r>
+      <w:r>
+        <w:rPr>
+          <w:b/>
+          <w:bCs/>
+        </w:rPr>
+        <w:t>en déduction</w:t>
+      </w:r>
+      <w:r>
+        <w:t xml:space="preserve"> de la recharge suivante : la caisse ne verse que les 300 000 réellement consommés.</w:t>
+      </w:r>
+    </w:p>
+    <w:p>
+      <w:pPr>
+        <w:pStyle w:val="NormalWeb"/>
+        <w:shd w:val="clear" w:color="auto" w:fill="EBF5EC"/>
+        <w:divId w:val="518082215"/>
+      </w:pPr>
+      <w:r>
+        <w:t>Ce qui n'arrive pas, c'est l'</w:t>
+      </w:r>
+      <w:r>
+        <w:rPr>
+          <w:b/>
+          <w:bCs/>
+        </w:rPr>
+        <w:t>accumulation</w:t>
+      </w:r>
+      <w:r>
+        <w:t>. La direction ne démarre pas le mois suivant à 700 000. Elle redémarre à 500 000. Le plafond est un niveau à retrouver, pas une dotation qui s'ajoute.</w:t>
+      </w:r>
+    </w:p>
+    <w:p>
+      <w:pPr>
+        <w:pStyle w:val="NormalWeb"/>
+        <w:shd w:val="clear" w:color="auto" w:fill="EBF5EC"/>
+        <w:divId w:val="518082215"/>
+      </w:pPr>
+      <w:r>
+        <w:t xml:space="preserve">La reprise du surplus (ligne 2 du tableau 4.1) ne se déclenche donc que dans deux cas : </w:t>
+      </w:r>
+      <w:r>
+        <w:t>une recharge manuelle exceptionnelle a poussé le solde au-dessus du plafond, ou le plafond lui-même a été revu à la baisse.</w:t>
+      </w:r>
+    </w:p>
+    <w:p>
+      <w:pPr>
+        <w:pStyle w:val="Titre3"/>
+        <w:rPr>
+          <w:rFonts w:eastAsia="Times New Roman"/>
+        </w:rPr>
+      </w:pPr>
+      <w:r>
+        <w:rPr>
+          <w:rFonts w:eastAsia="Times New Roman"/>
+        </w:rPr>
+        <w:t>4.3 Comment le réajustement est déclenché</w:t>
+      </w:r>
+    </w:p>
+    <w:p>
+      <w:pPr>
+        <w:pStyle w:val="NormalWeb"/>
+      </w:pPr>
+      <w:r>
+        <w:t>Un traitement automatique tourne au démarrage du serveur, puis toutes les heures. Il ne dépend d'aucun planificateur externe : si le serveur tourne, il tourne.</w:t>
+      </w:r>
+    </w:p>
+    <w:p>
+      <w:pPr>
+        <w:pStyle w:val="NormalWeb"/>
+      </w:pPr>
+      <w:r>
+        <w:t>Chaque portefeuille garde en mémoire le dernier mois où il a été réajusté. Le traitement peut donc s'exécuter des dizaines de fois par mois sans jamais recharger deux fois.</w:t>
+      </w:r>
+    </w:p>
+    <w:p>
+      <w:pPr>
+        <w:pStyle w:val="chemin"/>
+      </w:pPr>
+      <w:r>
+        <w:t>backend/src/modules/transactionnel/budget-mensuel.service.ts</w:t>
+      </w:r>
+    </w:p>
+    <w:p>
+      <w:pPr>
+        <w:pStyle w:val="Titre3"/>
+        <w:rPr>
+          <w:rFonts w:eastAsia="Times New Roman"/>
+        </w:rPr>
+      </w:pPr>
+      <w:r>
+        <w:rPr>
+          <w:rFonts w:eastAsia="Times New Roman"/>
+        </w:rPr>
+        <w:t>4.4 Quand la caisse source n'a pas de quoi recharger</w:t>
+      </w:r>
+    </w:p>
+    <w:p>
+      <w:pPr>
+        <w:pStyle w:val="NormalWeb"/>
+      </w:pPr>
+      <w:r>
+        <w:t xml:space="preserve">Le réajustement échoue, il est journalisé, et le mois </w:t>
+      </w:r>
+      <w:r>
+        <w:rPr>
+          <w:b/>
+          <w:bCs/>
+        </w:rPr>
         <w:t>n'est pas marqué comme traité</w:t>
       </w:r>
       <w:r>
-        <w:t xml:space="preserve">. </w:t>
-      </w:r>
-      <w:r>
-        <w:t>La tentative se rejouera donc à l'heure suivante, et ainsi de suite jusqu'à ce que la caisse soit approvisionnée.</w:t>
+        <w:t>. La tentative se rejouera donc à l'heure suivante, et ainsi de suite jusqu'à ce que la caisse soit approvisionnée.</w:t>
       </w:r>
     </w:p>
     <w:p>
@@ -2423,7 +4157,6 @@
         <w:pStyle w:val="NormalWeb"/>
       </w:pPr>
       <w:r>
-        <w:lastRenderedPageBreak/>
         <w:t>C'est un choix délibéré : plutôt que de créditer un portefeuille avec de l'argent que la caisse n'a pas — ce qui creuserait un solde négatif en silence — le système attend.</w:t>
       </w:r>
     </w:p>
@@ -2438,7 +4171,7 @@
         <w:rPr>
           <w:rFonts w:eastAsia="Times New Roman"/>
         </w:rPr>
-        <w:t>4. Le portefeuille de direction</w:t>
+        <w:t>5. Le portefeuille de direction</w:t>
       </w:r>
     </w:p>
     <w:p>
@@ -2460,7 +4193,7 @@
         <w:rPr>
           <w:rFonts w:eastAsia="Times New Roman"/>
         </w:rPr>
-        <w:t>4.1 Le budget n'est pas saisi, il est hérité</w:t>
+        <w:t>5.1 Le budget n'est pas saisi, il est hérité</w:t>
       </w:r>
     </w:p>
     <w:p>
@@ -2494,23 +4227,23 @@
         <w:pStyle w:val="Titre3"/>
         <w:shd w:val="clear" w:color="auto" w:fill="FBEAEA"/>
         <w:spacing w:before="0"/>
-        <w:divId w:val="365101960"/>
-        <w:rPr>
-          <w:rFonts w:eastAsia="Times New Roman"/>
-        </w:rPr>
-      </w:pPr>
-      <w:r>
-        <w:rPr>
-          <w:rFonts w:eastAsia="Times New Roman"/>
-        </w:rPr>
-        <w:t>4.2 Le piège : la direction sans centre de coût</w:t>
+        <w:divId w:val="190070121"/>
+        <w:rPr>
+          <w:rFonts w:eastAsia="Times New Roman"/>
+        </w:rPr>
+      </w:pPr>
+      <w:r>
+        <w:rPr>
+          <w:rFonts w:eastAsia="Times New Roman"/>
+        </w:rPr>
+        <w:t>5.2 Le piège : la direction sans centre de coût</w:t>
       </w:r>
     </w:p>
     <w:p>
       <w:pPr>
         <w:pStyle w:val="NormalWeb"/>
         <w:shd w:val="clear" w:color="auto" w:fill="FBEAEA"/>
-        <w:divId w:val="365101960"/>
+        <w:divId w:val="190070121"/>
       </w:pPr>
       <w:r>
         <w:t xml:space="preserve">Si la direction n'a </w:t>
@@ -2533,17 +4266,14 @@
         <w:t>pas</w:t>
       </w:r>
       <w:r>
-        <w:t xml:space="preserve"> de </w:t>
-      </w:r>
-      <w:r>
-        <w:t>budget mensuel, alors le portefeuille se crée avec un plafond vide.</w:t>
+        <w:t xml:space="preserve"> de budget mensuel, alors le portefeuille se crée avec un plafond vide.</w:t>
       </w:r>
     </w:p>
     <w:p>
       <w:pPr>
         <w:pStyle w:val="NormalWeb"/>
         <w:shd w:val="clear" w:color="auto" w:fill="FBEAEA"/>
-        <w:divId w:val="365101960"/>
+        <w:divId w:val="190070121"/>
       </w:pPr>
       <w:r>
         <w:t xml:space="preserve">Et un plafond vide signifie : </w:t>
@@ -2563,17 +4293,21 @@
       <w:pPr>
         <w:pStyle w:val="NormalWeb"/>
         <w:shd w:val="clear" w:color="auto" w:fill="FBEAEA"/>
-        <w:divId w:val="365101960"/>
+        <w:divId w:val="190070121"/>
       </w:pPr>
       <w:r>
         <w:rPr>
           <w:b/>
           <w:bCs/>
         </w:rPr>
+        <w:lastRenderedPageBreak/>
         <w:t>À faire avant de créer un portefeuille de direction :</w:t>
       </w:r>
       <w:r>
-        <w:t xml:space="preserve"> vérifier que la direction a bien un centre de coût, et que ce centre de coût a bien un budget mensuel renseigné.</w:t>
+        <w:t xml:space="preserve"> vérifier que la direction a bien </w:t>
+      </w:r>
+      <w:r>
+        <w:t>un centre de coût, et que ce centre de coût a bien un budget mensuel renseigné.</w:t>
       </w:r>
     </w:p>
     <w:p>
@@ -2587,7 +4321,7 @@
         <w:rPr>
           <w:rFonts w:eastAsia="Times New Roman"/>
         </w:rPr>
-        <w:t>4.3 L'accès est automatique, sans affectation individuelle</w:t>
+        <w:t>5.3 L'accès est automatique, sans affectation individuelle</w:t>
       </w:r>
     </w:p>
     <w:p>
@@ -2985,8 +4719,7 @@
         <w:rPr>
           <w:rFonts w:eastAsia="Times New Roman"/>
         </w:rPr>
-        <w:lastRenderedPageBreak/>
-        <w:t>4.4 Modifier le budget d'une direction</w:t>
+        <w:t>5.4 Modifier le budget d'une direction</w:t>
       </w:r>
     </w:p>
     <w:p>
@@ -3012,10 +4745,7 @@
         <w:pStyle w:val="NormalWeb"/>
       </w:pPr>
       <w:r>
-        <w:t xml:space="preserve">Modifier le portefeuille directement ne sert à rien : à chaque enregistrement, le serveur </w:t>
-      </w:r>
-      <w:r>
-        <w:t>relit le budget du centre de coût et écrase ce qui aurait pu être saisi.</w:t>
+        <w:t>Modifier le portefeuille directement ne sert à rien : à chaque enregistrement, le serveur relit le budget du centre de coût et écrase ce qui aurait pu être saisi.</w:t>
       </w:r>
     </w:p>
     <w:p>
@@ -3023,23 +4753,23 @@
         <w:pStyle w:val="Titre3"/>
         <w:shd w:val="clear" w:color="auto" w:fill="FDF6E3"/>
         <w:spacing w:before="0"/>
-        <w:divId w:val="1050106267"/>
-        <w:rPr>
-          <w:rFonts w:eastAsia="Times New Roman"/>
-        </w:rPr>
-      </w:pPr>
-      <w:r>
-        <w:rPr>
-          <w:rFonts w:eastAsia="Times New Roman"/>
-        </w:rPr>
-        <w:t>4.5 Un budget relevé en cours de mois prend effet le mois suivant</w:t>
+        <w:divId w:val="434518374"/>
+        <w:rPr>
+          <w:rFonts w:eastAsia="Times New Roman"/>
+        </w:rPr>
+      </w:pPr>
+      <w:r>
+        <w:rPr>
+          <w:rFonts w:eastAsia="Times New Roman"/>
+        </w:rPr>
+        <w:t>5.5 Un budget relevé en cours de mois prend effet le mois suivant</w:t>
       </w:r>
     </w:p>
     <w:p>
       <w:pPr>
         <w:pStyle w:val="NormalWeb"/>
         <w:shd w:val="clear" w:color="auto" w:fill="FDF6E3"/>
-        <w:divId w:val="1050106267"/>
+        <w:divId w:val="434518374"/>
       </w:pPr>
       <w:r>
         <w:t>La répercussion change bien le plafond du portefeuille, mais elle ne réarme pas le compteur qui mémorise « ce mois-ci a déjà été traité ».</w:t>
@@ -3049,7 +4779,7 @@
       <w:pPr>
         <w:pStyle w:val="NormalWeb"/>
         <w:shd w:val="clear" w:color="auto" w:fill="FDF6E3"/>
-        <w:divId w:val="1050106267"/>
+        <w:divId w:val="434518374"/>
       </w:pPr>
       <w:r>
         <w:t xml:space="preserve">Concrètement : si on relève le budget d'une direction le 15 du mois, le nouveau plafond est bien enregistré, mais </w:t>
@@ -3062,17 +4792,14 @@
         <w:t>aucune recharge complémentaire n'a lieu ce mois-ci</w:t>
       </w:r>
       <w:r>
-        <w:t xml:space="preserve">. Le </w:t>
-      </w:r>
-      <w:r>
-        <w:t>portefeuille ne sera aligné sur le nouveau montant qu'au premier passage du mois suivant.</w:t>
+        <w:t>. Le portefeuille ne sera aligné sur le nouveau montant qu'au premier passage du mois suivant.</w:t>
       </w:r>
     </w:p>
     <w:p>
       <w:pPr>
         <w:pStyle w:val="NormalWeb"/>
         <w:shd w:val="clear" w:color="auto" w:fill="FDF6E3"/>
-        <w:divId w:val="1050106267"/>
+        <w:divId w:val="434518374"/>
       </w:pPr>
       <w:r>
         <w:t>Si le besoin est immédiat, il faut passer par une demande de recharge ordinaire.</w:t>
@@ -3089,7 +4816,7 @@
         <w:rPr>
           <w:rFonts w:eastAsia="Times New Roman"/>
         </w:rPr>
-        <w:t>4.6 Récapitulatif : créer un portefeuille pour une direction</w:t>
+        <w:t>5.6 Récapitulatif : créer un portefeuille pour une direction</w:t>
       </w:r>
     </w:p>
     <w:tbl>
@@ -3721,7 +5448,225 @@
         <w:rPr>
           <w:rFonts w:eastAsia="Times New Roman"/>
         </w:rPr>
-        <w:t>5. Qui voit quels portefeuilles</w:t>
+        <w:t>6. Le centre de coût : deux rôles sans rapport</w:t>
+      </w:r>
+    </w:p>
+    <w:p>
+      <w:pPr>
+        <w:pStyle w:val="NormalWeb"/>
+      </w:pPr>
+      <w:r>
+        <w:t>Le centre de coût intervient à deux moments complètement différents. Les confondre est la principale source de malentendu sur les budgets.</w:t>
+      </w:r>
+    </w:p>
+    <w:p>
+      <w:pPr>
+        <w:pStyle w:val="Titre3"/>
+        <w:rPr>
+          <w:rFonts w:eastAsia="Times New Roman"/>
+        </w:rPr>
+      </w:pPr>
+      <w:r>
+        <w:rPr>
+          <w:rFonts w:eastAsia="Times New Roman"/>
+        </w:rPr>
+        <w:t>6.1 Premier rôle : il finance le portefeuille</w:t>
+      </w:r>
+    </w:p>
+    <w:p>
+      <w:pPr>
+        <w:pStyle w:val="NormalWeb"/>
+      </w:pPr>
+      <w:r>
+        <w:t xml:space="preserve">C'est ce qui est décrit en 5.1. Le budget mensuel du centre de coût devient le plafond du portefeuille de la direction. Il détermine </w:t>
+      </w:r>
+      <w:r>
+        <w:rPr>
+          <w:b/>
+          <w:bCs/>
+        </w:rPr>
+        <w:t>combien d'argent entre</w:t>
+      </w:r>
+      <w:r>
+        <w:t xml:space="preserve"> dans l'enveloppe chaque mois.</w:t>
+      </w:r>
+    </w:p>
+    <w:p>
+      <w:pPr>
+        <w:pStyle w:val="Titre3"/>
+        <w:rPr>
+          <w:rFonts w:eastAsia="Times New Roman"/>
+        </w:rPr>
+      </w:pPr>
+      <w:r>
+        <w:rPr>
+          <w:rFonts w:eastAsia="Times New Roman"/>
+        </w:rPr>
+        <w:t>6.2 Second rôle : il plafonne les dépenses</w:t>
+      </w:r>
+    </w:p>
+    <w:p>
+      <w:pPr>
+        <w:pStyle w:val="NormalWeb"/>
+      </w:pPr>
+      <w:r>
+        <w:t xml:space="preserve">Avant chaque décaissement, le serveur additionne toutes les écritures de charge imputées à ce centre de coût </w:t>
+      </w:r>
+      <w:r>
+        <w:rPr>
+          <w:b/>
+          <w:bCs/>
+        </w:rPr>
+        <w:t>depuis le 1er du mois en cours</w:t>
+      </w:r>
+      <w:r>
+        <w:t>, et refuse l'opération si le total dépasserait le budget.</w:t>
+      </w:r>
+    </w:p>
+    <w:p>
+      <w:pPr>
+        <w:pStyle w:val="NormalWeb"/>
+      </w:pPr>
+      <w:r>
+        <w:t>Le refus est chiffré, pour que le caissier sache où il en est :</w:t>
+      </w:r>
+    </w:p>
+    <w:p>
+      <w:pPr>
+        <w:pStyle w:val="NormalWeb"/>
+        <w:ind w:left="400"/>
+      </w:pPr>
+      <w:r>
+        <w:rPr>
+          <w:i/>
+          <w:iCs/>
+        </w:rPr>
+        <w:t>« Budget mensuel du centre de coût « DG01 » dépassé : plafond 500 000,00, déjà décaissé ce mois 480 000,00, reste disponible 20 000,00. Décaissement de 35 000,00 refusé. »</w:t>
+      </w:r>
+    </w:p>
+    <w:p>
+      <w:pPr>
+        <w:pStyle w:val="NormalWeb"/>
+      </w:pPr>
+      <w:r>
+        <w:t>Sans budget sur le centre de coût, aucune limite n'est appliquée : tout passe.</w:t>
+      </w:r>
+    </w:p>
+    <w:p>
+      <w:pPr>
+        <w:pStyle w:val="chemin"/>
+      </w:pPr>
+      <w:r>
+        <w:t>backend/src/modules/transactionnel/ledger.service.ts — assertCostCenterMonthlyBudget()</w:t>
+      </w:r>
+    </w:p>
+    <w:p>
+      <w:pPr>
+        <w:pStyle w:val="Titre3"/>
+        <w:rPr>
+          <w:rFonts w:eastAsia="Times New Roman"/>
+        </w:rPr>
+      </w:pPr>
+      <w:r>
+        <w:rPr>
+          <w:rFonts w:eastAsia="Times New Roman"/>
+        </w:rPr>
+        <w:t>6.3 Le même nombre sert donc deux fois</w:t>
+      </w:r>
+    </w:p>
+    <w:p>
+      <w:pPr>
+        <w:pStyle w:val="NormalWeb"/>
+      </w:pPr>
+      <w:r>
+        <w:t xml:space="preserve">Le budget mensuel du centre de coût alimente le portefeuille </w:t>
+      </w:r>
+      <w:r>
+        <w:rPr>
+          <w:b/>
+          <w:bCs/>
+        </w:rPr>
+        <w:t>et</w:t>
+      </w:r>
+      <w:r>
+        <w:t xml:space="preserve"> plafonne les charges. </w:t>
+      </w:r>
+      <w:r>
+        <w:t>Les deux vues coïncident tant qu'une direction n'a qu'un seul portefeuille adossé à ce centre de coût — c'est le cas aujourd'hui.</w:t>
+      </w:r>
+    </w:p>
+    <w:p>
+      <w:pPr>
+        <w:pStyle w:val="NormalWeb"/>
+        <w:shd w:val="clear" w:color="auto" w:fill="FDF6E3"/>
+        <w:spacing w:before="0" w:beforeAutospacing="0"/>
+        <w:divId w:val="1480802998"/>
+      </w:pPr>
+      <w:r>
+        <w:rPr>
+          <w:b/>
+          <w:bCs/>
+        </w:rPr>
+        <w:t>Attention si l'on multiplie les enveloppes.</w:t>
+      </w:r>
+      <w:r>
+        <w:t xml:space="preserve"> Deux portefeuilles sur la même direction seraient financés à 500 000 </w:t>
+      </w:r>
+      <w:r>
+        <w:rPr>
+          <w:i/>
+          <w:iCs/>
+        </w:rPr>
+        <w:t>chacun</w:t>
+      </w:r>
+      <w:r>
+        <w:t xml:space="preserve">, mais leurs dépenses cumulées resteraient bloquées à 500 000 </w:t>
+      </w:r>
+      <w:r>
+        <w:rPr>
+          <w:i/>
+          <w:iCs/>
+        </w:rPr>
+        <w:t>au total</w:t>
+      </w:r>
+      <w:r>
+        <w:t>. Le second portefeuille serait alimenté sans jamais pouvoir être dépensé.</w:t>
+      </w:r>
+    </w:p>
+    <w:p>
+      <w:pPr>
+        <w:pStyle w:val="Titre3"/>
+        <w:rPr>
+          <w:rFonts w:eastAsia="Times New Roman"/>
+        </w:rPr>
+      </w:pPr>
+      <w:r>
+        <w:rPr>
+          <w:rFonts w:eastAsia="Times New Roman"/>
+        </w:rPr>
+        <w:t>6.4 Le centre de coût est aussi imposé par la nature comptable</w:t>
+      </w:r>
+    </w:p>
+    <w:p>
+      <w:pPr>
+        <w:pStyle w:val="NormalWeb"/>
+      </w:pPr>
+      <w:r>
+        <w:t>Sur un bon, le centre de coût n'est pas choisi librement : c'est la nature comptable retenue qui le détermine. Cela garantit que deux dépenses de même nature ne partent pas sur deux imputations différentes selon qui saisit.</w:t>
+      </w:r>
+    </w:p>
+    <w:p>
+      <w:pPr>
+        <w:pStyle w:val="Titre2"/>
+        <w:rPr>
+          <w:rFonts w:eastAsia="Times New Roman"/>
+        </w:rPr>
+      </w:pPr>
+      <w:r>
+        <w:rPr>
+          <w:rFonts w:eastAsia="Times New Roman"/>
+        </w:rPr>
+        <w:t>7. Qui voit quels portefeuilles</w:t>
       </w:r>
     </w:p>
     <w:tbl>
@@ -3777,7 +5722,6 @@
                 <w:sz w:val="22"/>
                 <w:szCs w:val="22"/>
               </w:rPr>
-              <w:lastRenderedPageBreak/>
               <w:t>Profil</w:t>
             </w:r>
           </w:p>
@@ -4047,7 +5991,7 @@
                 <w:sz w:val="22"/>
                 <w:szCs w:val="22"/>
               </w:rPr>
-              <w:t>Uniquement leur périmètre (voir 4.3)</w:t>
+              <w:t>Uniquement leur périmètre (voir 5.3)</w:t>
             </w:r>
           </w:p>
         </w:tc>
@@ -4084,7 +6028,7 @@
         <w:rPr>
           <w:rFonts w:eastAsia="Times New Roman"/>
         </w:rPr>
-        <w:t>6. Désactivation et suppression</w:t>
+        <w:t>8. Désactivation et suppression</w:t>
       </w:r>
     </w:p>
     <w:p>
@@ -4475,7 +6419,7 @@
       <w:pPr>
         <w:numPr>
           <w:ilvl w:val="0"/>
-          <w:numId w:val="1"/>
+          <w:numId w:val="2"/>
         </w:numPr>
         <w:spacing w:before="100" w:beforeAutospacing="1" w:after="100" w:afterAutospacing="1"/>
         <w:rPr>
@@ -4493,7 +6437,7 @@
       <w:pPr>
         <w:numPr>
           <w:ilvl w:val="0"/>
-          <w:numId w:val="1"/>
+          <w:numId w:val="2"/>
         </w:numPr>
         <w:spacing w:before="100" w:beforeAutospacing="1" w:after="100" w:afterAutospacing="1"/>
         <w:rPr>
@@ -4526,7 +6470,7 @@
         <w:rPr>
           <w:rFonts w:eastAsia="Times New Roman"/>
         </w:rPr>
-        <w:t>7. Points à trancher</w:t>
+        <w:t>9. Points à trancher</w:t>
       </w:r>
     </w:p>
     <w:p>
@@ -4540,7 +6484,7 @@
         <w:rPr>
           <w:rFonts w:eastAsia="Times New Roman"/>
         </w:rPr>
-        <w:t>7.1 La devise n'est pas vérifiée à la création</w:t>
+        <w:t>9.1 La devise n'est pas vérifiée à la création</w:t>
       </w:r>
     </w:p>
     <w:p>
@@ -4598,7 +6542,7 @@
         <w:rPr>
           <w:rFonts w:eastAsia="Times New Roman"/>
         </w:rPr>
-        <w:t>7.2 « Une direction = un centre de coût » n'est imposé nulle part</w:t>
+        <w:t>9.2 « Une direction = un centre de coût » n'est imposé nulle part</w:t>
       </w:r>
     </w:p>
     <w:p>
@@ -4606,7 +6550,7 @@
         <w:pStyle w:val="NormalWeb"/>
       </w:pPr>
       <w:r>
-        <w:t xml:space="preserve">Toute l'héritage du budget repose sur cette règle. Aujourd'hui elle est respectée : aucune direction n'a plusieurs centres de coût. Mais </w:t>
+        <w:t xml:space="preserve">Tout l'héritage du budget repose sur cette règle. Aujourd'hui elle est respectée : aucune direction n'a plusieurs centres de coût. Mais </w:t>
       </w:r>
       <w:r>
         <w:rPr>
@@ -4653,7 +6597,7 @@
         <w:rPr>
           <w:rFonts w:eastAsia="Times New Roman"/>
         </w:rPr>
-        <w:t>7.3 Le filtre « actifs seulement » est appliqué à l'écran, pas en base</w:t>
+        <w:t>9.3 Le filtre « actifs seulement » est appliqué à l'écran, pas en base</w:t>
       </w:r>
     </w:p>
     <w:p>
@@ -4692,6 +6636,74 @@
     </w:p>
     <w:p>
       <w:pPr>
+        <w:pStyle w:val="Titre3"/>
+        <w:rPr>
+          <w:rFonts w:eastAsia="Times New Roman"/>
+        </w:rPr>
+      </w:pPr>
+      <w:r>
+        <w:rPr>
+          <w:rFonts w:eastAsia="Times New Roman"/>
+        </w:rPr>
+        <w:t>9.4 Deux définitions du mois cohabitent</w:t>
+      </w:r>
+    </w:p>
+    <w:p>
+      <w:pPr>
+        <w:pStyle w:val="NormalWeb"/>
+      </w:pPr>
+      <w:r>
+        <w:t xml:space="preserve">Le réajustement mensuel raisonne en heure </w:t>
+      </w:r>
+      <w:r>
+        <w:rPr>
+          <w:b/>
+          <w:bCs/>
+        </w:rPr>
+        <w:t>universelle</w:t>
+      </w:r>
+      <w:r>
+        <w:t xml:space="preserve"> (UTC), alors que le plafond de dépense du centre de coût raisonne en heure </w:t>
+      </w:r>
+      <w:r>
+        <w:rPr>
+          <w:b/>
+          <w:bCs/>
+        </w:rPr>
+        <w:t>locale</w:t>
+      </w:r>
+      <w:r>
+        <w:t>. Sur un fuseau à l'heure de Greenwich comme Abidjan, l'écart est nul aujourd'hui.</w:t>
+      </w:r>
+    </w:p>
+    <w:p>
+      <w:pPr>
+        <w:pStyle w:val="NormalWeb"/>
+      </w:pPr>
+      <w:r>
+        <w:t xml:space="preserve">Il resterait nul en cas de déploiement dans un pays décalé, mais les deux traitements changeraient de mois à quelques heures d'intervalle. Sans conséquence connue à ce jour ; à </w:t>
+      </w:r>
+      <w:r>
+        <w:t>garder en tête si l'application sort de la zone.</w:t>
+      </w:r>
+    </w:p>
+    <w:p>
+      <w:pPr>
+        <w:pStyle w:val="NormalWeb"/>
+      </w:pPr>
+      <w:r>
+        <w:rPr>
+          <w:b/>
+          <w:bCs/>
+        </w:rPr>
+        <w:t>Question :</w:t>
+      </w:r>
+      <w:r>
+        <w:t xml:space="preserve"> uniformise-t-on par précaution, ou laisse-t-on en l'état ?</w:t>
+      </w:r>
+    </w:p>
+    <w:p>
+      <w:pPr>
         <w:pStyle w:val="Titre2"/>
         <w:rPr>
           <w:rFonts w:eastAsia="Times New Roman"/>
@@ -4701,7 +6713,7 @@
         <w:rPr>
           <w:rFonts w:eastAsia="Times New Roman"/>
         </w:rPr>
-        <w:t>8. État actuel en base</w:t>
+        <w:t>10. État actuel en base</w:t>
       </w:r>
     </w:p>
     <w:p>
@@ -5193,10 +7205,28 @@
         <w:pStyle w:val="NormalWeb"/>
       </w:pPr>
       <w:r>
-        <w:t xml:space="preserve">Les six portefeuilles de direction ont tous un budget : le piège décrit en 4.2 n'a donc touché aucun d'eux jusqu'ici. Côté utilisateurs, un seul portefeuille sur sept a un plafond mensuel — les six autres ne sont jamais réajustés automatiquement, ce qui est cohérent avec </w:t>
-      </w:r>
-      <w:r>
-        <w:t>un fonctionnement à la demande de recharge.</w:t>
+        <w:t>Les six portefeuilles de direction ont tous un budget : le piège décrit en 5.2 n'a donc touché aucun d'eux jusqu'ici.</w:t>
+      </w:r>
+    </w:p>
+    <w:p>
+      <w:pPr>
+        <w:pStyle w:val="NormalWeb"/>
+      </w:pPr>
+      <w:r>
+        <w:t xml:space="preserve">Côté utilisateurs, un seul portefeuille sur sept a un plafond mensuel. Les six autres ne sont </w:t>
+      </w:r>
+      <w:r>
+        <w:rPr>
+          <w:b/>
+          <w:bCs/>
+        </w:rPr>
+        <w:t>jamais</w:t>
+      </w:r>
+      <w:r>
+        <w:t xml:space="preserve"> </w:t>
+      </w:r>
+      <w:r>
+        <w:t>réajustés automatiquement et vivent uniquement de demandes de recharge — ce qui est un mode de fonctionnement parfaitement valable, pas une anomalie.</w:t>
       </w:r>
     </w:p>
     <w:p>
@@ -5220,9 +7250,9 @@
 <file path=word/numbering.xml><?xml version="1.0" encoding="utf-8"?>
 <w:numbering xmlns:wpc="http://schemas.microsoft.com/office/word/2010/wordprocessingCanvas" xmlns:cx="http://schemas.microsoft.com/office/drawing/2014/chartex" xmlns:cx1="http://schemas.microsoft.com/office/drawing/2015/9/8/chartex" xmlns:cx2="http://schemas.microsoft.com/office/drawing/2015/10/21/chartex" xmlns:cx3="http://schemas.microsoft.com/office/drawing/2016/5/9/chartex" xmlns:cx4="http://schemas.microsoft.com/office/drawing/2016/5/10/chartex" xmlns:cx5="http://schemas.microsoft.com/office/drawing/2016/5/11/chartex" xmlns:cx6="http://schemas.microsoft.com/office/drawing/2016/5/12/chartex" xmlns:cx7="http://schemas.microsoft.com/office/drawing/2016/5/13/chartex" xmlns:cx8="http://schemas.microsoft.com/office/drawing/2016/5/14/chartex" xmlns:mc="http://schemas.openxmlformats.org/markup-compatibility/2006" xmlns:aink="http://schemas.microsoft.com/office/drawing/2016/ink" xmlns:am3d="http://schemas.microsoft.com/office/drawing/2017/model3d" xmlns:o="urn:schemas-microsoft-com:office:office" xmlns:oel="http://schemas.microsoft.com/office/2019/extlst" xmlns:r="http://schemas.openxmlformats.org/officeDocument/2006/relationships" xmlns:m="http://schemas.openxmlformats.org/officeDocument/2006/math" xmlns:v="urn:schemas-microsoft-com:vml" xmlns:wp14="http://schemas.microsoft.com/office/word/2010/wordprocessingDrawing" xmlns:wp="http://schemas.openxmlformats.org/drawingml/2006/wordprocessingDrawing" xmlns:w10="urn:schemas-microsoft-com:office:word" xmlns:w="http://schemas.openxmlformats.org/wordprocessingml/2006/main" xmlns:w14="http://schemas.microsoft.com/office/word/2010/wordml" xmlns:w15="http://schemas.microsoft.com/office/word/2012/wordml" xmlns:w16cei="http://schemas.microsoft.com/office/word/2026/wordml/cei" xmlns:w16cex="http://schemas.microsoft.com/office/word/2018/wordml/cex" xmlns:w16cid="http://schemas.microsoft.com/office/word/2016/wordml/cid" xmlns:w16="http://schemas.microsoft.com/office/word/2018/wordml" xmlns:w16du="http://schemas.microsoft.com/office/word/2023/wordml/word16du" xmlns:w16sdtdh="http://schemas.microsoft.com/office/word/2020/wordml/sdtdatahash" xmlns:w16sdtfl="http://schemas.microsoft.com/office/word/2024/wordml/sdtformatlock" xmlns:w16se="http://schemas.microsoft.com/office/word/2015/wordml/symex" xmlns:wpg="http://schemas.microsoft.com/office/word/2010/wordprocessingGroup" xmlns:wpi="http://schemas.microsoft.com/office/word/2010/wordprocessingInk" xmlns:wne="http://schemas.microsoft.com/office/word/2006/wordml" xmlns:wps="http://schemas.microsoft.com/office/word/2010/wordprocessingShape" mc:Ignorable="w14 w15 w16se w16cid w16 w16cex w16sdtdh w16sdtfl w16du wp14">
   <w:abstractNum w:abstractNumId="0" w15:restartNumberingAfterBreak="0">
-    <w:nsid w:val="200F220B"/>
+    <w:nsid w:val="14D85C3F"/>
     <w:multiLevelType w:val="multilevel"/>
-    <w:tmpl w:val="C6F0874C"/>
+    <w:tmpl w:val="25AE066A"/>
     <w:lvl w:ilvl="0">
       <w:start w:val="1"/>
       <w:numFmt w:val="bullet"/>
@@ -5368,8 +7398,160 @@
       </w:rPr>
     </w:lvl>
   </w:abstractNum>
-  <w:num w:numId="1" w16cid:durableId="2051682619">
+  <w:abstractNum w:abstractNumId="1" w15:restartNumberingAfterBreak="0">
+    <w:nsid w:val="5CEB7F41"/>
+    <w:multiLevelType w:val="multilevel"/>
+    <w:tmpl w:val="6A188582"/>
+    <w:lvl w:ilvl="0">
+      <w:start w:val="1"/>
+      <w:numFmt w:val="bullet"/>
+      <w:lvlText w:val=""/>
+      <w:lvlJc w:val="left"/>
+      <w:pPr>
+        <w:tabs>
+          <w:tab w:val="num" w:pos="720"/>
+        </w:tabs>
+        <w:ind w:left="720" w:hanging="360"/>
+      </w:pPr>
+      <w:rPr>
+        <w:rFonts w:ascii="Symbol" w:hAnsi="Symbol" w:hint="default"/>
+        <w:sz w:val="20"/>
+      </w:rPr>
+    </w:lvl>
+    <w:lvl w:ilvl="1" w:tentative="1">
+      <w:start w:val="1"/>
+      <w:numFmt w:val="bullet"/>
+      <w:lvlText w:val="o"/>
+      <w:lvlJc w:val="left"/>
+      <w:pPr>
+        <w:tabs>
+          <w:tab w:val="num" w:pos="1440"/>
+        </w:tabs>
+        <w:ind w:left="1440" w:hanging="360"/>
+      </w:pPr>
+      <w:rPr>
+        <w:rFonts w:ascii="Courier New" w:hAnsi="Courier New" w:hint="default"/>
+        <w:sz w:val="20"/>
+      </w:rPr>
+    </w:lvl>
+    <w:lvl w:ilvl="2" w:tentative="1">
+      <w:start w:val="1"/>
+      <w:numFmt w:val="bullet"/>
+      <w:lvlText w:val=""/>
+      <w:lvlJc w:val="left"/>
+      <w:pPr>
+        <w:tabs>
+          <w:tab w:val="num" w:pos="2160"/>
+        </w:tabs>
+        <w:ind w:left="2160" w:hanging="360"/>
+      </w:pPr>
+      <w:rPr>
+        <w:rFonts w:ascii="Wingdings" w:hAnsi="Wingdings" w:hint="default"/>
+        <w:sz w:val="20"/>
+      </w:rPr>
+    </w:lvl>
+    <w:lvl w:ilvl="3" w:tentative="1">
+      <w:start w:val="1"/>
+      <w:numFmt w:val="bullet"/>
+      <w:lvlText w:val=""/>
+      <w:lvlJc w:val="left"/>
+      <w:pPr>
+        <w:tabs>
+          <w:tab w:val="num" w:pos="2880"/>
+        </w:tabs>
+        <w:ind w:left="2880" w:hanging="360"/>
+      </w:pPr>
+      <w:rPr>
+        <w:rFonts w:ascii="Wingdings" w:hAnsi="Wingdings" w:hint="default"/>
+        <w:sz w:val="20"/>
+      </w:rPr>
+    </w:lvl>
+    <w:lvl w:ilvl="4" w:tentative="1">
+      <w:start w:val="1"/>
+      <w:numFmt w:val="bullet"/>
+      <w:lvlText w:val=""/>
+      <w:lvlJc w:val="left"/>
+      <w:pPr>
+        <w:tabs>
+          <w:tab w:val="num" w:pos="3600"/>
+        </w:tabs>
+        <w:ind w:left="3600" w:hanging="360"/>
+      </w:pPr>
+      <w:rPr>
+        <w:rFonts w:ascii="Wingdings" w:hAnsi="Wingdings" w:hint="default"/>
+        <w:sz w:val="20"/>
+      </w:rPr>
+    </w:lvl>
+    <w:lvl w:ilvl="5" w:tentative="1">
+      <w:start w:val="1"/>
+      <w:numFmt w:val="bullet"/>
+      <w:lvlText w:val=""/>
+      <w:lvlJc w:val="left"/>
+      <w:pPr>
+        <w:tabs>
+          <w:tab w:val="num" w:pos="4320"/>
+        </w:tabs>
+        <w:ind w:left="4320" w:hanging="360"/>
+      </w:pPr>
+      <w:rPr>
+        <w:rFonts w:ascii="Wingdings" w:hAnsi="Wingdings" w:hint="default"/>
+        <w:sz w:val="20"/>
+      </w:rPr>
+    </w:lvl>
+    <w:lvl w:ilvl="6" w:tentative="1">
+      <w:start w:val="1"/>
+      <w:numFmt w:val="bullet"/>
+      <w:lvlText w:val=""/>
+      <w:lvlJc w:val="left"/>
+      <w:pPr>
+        <w:tabs>
+          <w:tab w:val="num" w:pos="5040"/>
+        </w:tabs>
+        <w:ind w:left="5040" w:hanging="360"/>
+      </w:pPr>
+      <w:rPr>
+        <w:rFonts w:ascii="Wingdings" w:hAnsi="Wingdings" w:hint="default"/>
+        <w:sz w:val="20"/>
+      </w:rPr>
+    </w:lvl>
+    <w:lvl w:ilvl="7" w:tentative="1">
+      <w:start w:val="1"/>
+      <w:numFmt w:val="bullet"/>
+      <w:lvlText w:val=""/>
+      <w:lvlJc w:val="left"/>
+      <w:pPr>
+        <w:tabs>
+          <w:tab w:val="num" w:pos="5760"/>
+        </w:tabs>
+        <w:ind w:left="5760" w:hanging="360"/>
+      </w:pPr>
+      <w:rPr>
+        <w:rFonts w:ascii="Wingdings" w:hAnsi="Wingdings" w:hint="default"/>
+        <w:sz w:val="20"/>
+      </w:rPr>
+    </w:lvl>
+    <w:lvl w:ilvl="8" w:tentative="1">
+      <w:start w:val="1"/>
+      <w:numFmt w:val="bullet"/>
+      <w:lvlText w:val=""/>
+      <w:lvlJc w:val="left"/>
+      <w:pPr>
+        <w:tabs>
+          <w:tab w:val="num" w:pos="6480"/>
+        </w:tabs>
+        <w:ind w:left="6480" w:hanging="360"/>
+      </w:pPr>
+      <w:rPr>
+        <w:rFonts w:ascii="Wingdings" w:hAnsi="Wingdings" w:hint="default"/>
+        <w:sz w:val="20"/>
+      </w:rPr>
+    </w:lvl>
+  </w:abstractNum>
+  <w:num w:numId="1" w16cid:durableId="1191260489">
     <w:abstractNumId w:val="0"/>
+  </w:num>
+  <w:num w:numId="2" w16cid:durableId="780149862">
+    <w:abstractNumId w:val="1"/>
   </w:num>
 </w:numbering>
 </file>
@@ -5932,6 +8114,17 @@
       <w:spacing w:before="160" w:after="160"/>
     </w:pPr>
   </w:style>
+  <w:style w:type="paragraph" w:customStyle="1" w:styleId="ok">
+    <w:name w:val="ok"/>
+    <w:basedOn w:val="Normal"/>
+    <w:pPr>
+      <w:pBdr>
+        <w:left w:val="single" w:sz="36" w:space="10" w:color="2E7D32"/>
+      </w:pBdr>
+      <w:shd w:val="clear" w:color="auto" w:fill="EBF5EC"/>
+      <w:spacing w:before="160" w:after="160"/>
+    </w:pPr>
+  </w:style>
   <w:style w:type="paragraph" w:customStyle="1" w:styleId="chemin">
     <w:name w:val="chemin"/>
     <w:basedOn w:val="Normal"/>

</xml_diff>